<commit_message>
Retain User Selection and Fix Minor Errors
</commit_message>
<xml_diff>
--- a/Final Report.docx
+++ b/Final Report.docx
@@ -8,6 +8,9 @@
         <w:jc w:val="both"/>
       </w:pPr>
       <w:r>
+        <w:t xml:space="preserve">1.0 </w:t>
+      </w:r>
+      <w:r>
         <w:t>Executive Summary</w:t>
       </w:r>
     </w:p>
@@ -16,6 +19,9 @@
         <w:pStyle w:val="Heading2"/>
       </w:pPr>
       <w:r>
+        <w:t xml:space="preserve">1.1 </w:t>
+      </w:r>
+      <w:r>
         <w:t>Project Context and Objectives</w:t>
       </w:r>
     </w:p>
@@ -73,6 +79,9 @@
       <w:pPr>
         <w:pStyle w:val="Heading2"/>
       </w:pPr>
+      <w:r>
+        <w:t xml:space="preserve">1.2 </w:t>
+      </w:r>
       <w:r>
         <w:t>Core Deliverables and Key Outcomes</w:t>
       </w:r>
@@ -418,7 +427,7 @@
         <w:rPr>
           <w:lang w:val="en-MY" w:eastAsia="zh-CN"/>
         </w:rPr>
-        <w:t xml:space="preserve">this system resolved real-world government data anomalies prior to modelling, including text encoding inconsistencies, comma-formatted numbers, non-standard month abbreviations, </w:t>
+        <w:t xml:space="preserve">this system resolved real-world government data anomalies prior to modelling, including text comma-formatted numbers, non-standard month abbreviations, </w:t>
       </w:r>
       <w:r>
         <w:rPr>
@@ -569,6 +578,9 @@
       </w:pPr>
       <w:r>
         <w:lastRenderedPageBreak/>
+        <w:t xml:space="preserve">2.0 </w:t>
+      </w:r>
+      <w:r>
         <w:t>Introduction</w:t>
       </w:r>
     </w:p>
@@ -577,6 +589,9 @@
         <w:pStyle w:val="Heading2"/>
       </w:pPr>
       <w:r>
+        <w:t xml:space="preserve">2.1 </w:t>
+      </w:r>
+      <w:r>
         <w:t>Background and Motivation</w:t>
       </w:r>
     </w:p>
@@ -636,6 +651,9 @@
       <w:pPr>
         <w:pStyle w:val="Heading2"/>
       </w:pPr>
+      <w:r>
+        <w:t xml:space="preserve">2.2 </w:t>
+      </w:r>
       <w:r>
         <w:t>Problem Definition</w:t>
       </w:r>
@@ -885,8 +903,30 @@
     </w:p>
     <w:p>
       <w:pPr>
+        <w:spacing w:after="160" w:line="259" w:lineRule="auto"/>
+        <w:jc w:val="left"/>
+        <w:rPr>
+          <w:rFonts w:eastAsiaTheme="majorEastAsia" w:cstheme="majorBidi"/>
+          <w:color w:val="2F5496" w:themeColor="accent1" w:themeShade="BF"/>
+          <w:kern w:val="2"/>
+          <w:sz w:val="28"/>
+          <w:szCs w:val="26"/>
+          <w:lang w:val="en-MY" w:eastAsia="zh-CN"/>
+          <w14:ligatures w14:val="standardContextual"/>
+        </w:rPr>
+      </w:pPr>
+      <w:r>
+        <w:br w:type="page"/>
+      </w:r>
+    </w:p>
+    <w:p>
+      <w:pPr>
         <w:pStyle w:val="Heading2"/>
       </w:pPr>
+      <w:r>
+        <w:lastRenderedPageBreak/>
+        <w:t xml:space="preserve">2.3 </w:t>
+      </w:r>
       <w:r>
         <w:t>Scope and Constraints</w:t>
       </w:r>
@@ -921,7 +961,6 @@
           <w:bCs/>
           <w:lang w:val="en-MY" w:eastAsia="zh-CN"/>
         </w:rPr>
-        <w:lastRenderedPageBreak/>
         <w:t>Geographic Focus</w:t>
       </w:r>
       <w:r>
@@ -1091,6 +1130,9 @@
         <w:jc w:val="both"/>
       </w:pPr>
       <w:r>
+        <w:t xml:space="preserve">3.0 </w:t>
+      </w:r>
+      <w:r>
         <w:t>System Requirements and Specifications</w:t>
       </w:r>
     </w:p>
@@ -1098,6 +1140,9 @@
       <w:pPr>
         <w:pStyle w:val="Heading2"/>
       </w:pPr>
+      <w:r>
+        <w:t xml:space="preserve">3.1 </w:t>
+      </w:r>
       <w:r>
         <w:t>Functional Requirements</w:t>
       </w:r>
@@ -1385,23 +1430,7 @@
                 <w:szCs w:val="24"/>
                 <w:lang w:val="en-MY" w:eastAsia="zh-CN"/>
               </w:rPr>
-              <w:t>, including text encoding</w:t>
-            </w:r>
-            <w:r>
-              <w:rPr>
-                <w:sz w:val="24"/>
-                <w:szCs w:val="24"/>
-                <w:lang w:val="en-MY" w:eastAsia="zh-CN"/>
-              </w:rPr>
-              <w:t xml:space="preserve"> errors</w:t>
-            </w:r>
-            <w:r>
-              <w:rPr>
-                <w:sz w:val="24"/>
-                <w:szCs w:val="24"/>
-                <w:lang w:val="en-MY" w:eastAsia="zh-CN"/>
-              </w:rPr>
-              <w:t xml:space="preserve">, </w:t>
+              <w:t xml:space="preserve">, including </w:t>
             </w:r>
             <w:r>
               <w:rPr>
@@ -1967,6 +1996,7 @@
                 <w:szCs w:val="24"/>
                 <w:lang w:val="en-MY" w:eastAsia="zh-CN"/>
               </w:rPr>
+              <w:lastRenderedPageBreak/>
               <w:t>FR8</w:t>
             </w:r>
           </w:p>
@@ -2099,14 +2129,7 @@
               <w:rPr>
                 <w:lang w:eastAsia="zh-CN"/>
               </w:rPr>
-              <w:t xml:space="preserve">configuration, forecasting, and </w:t>
-            </w:r>
-            <w:r>
-              <w:rPr>
-                <w:lang w:eastAsia="zh-CN"/>
-              </w:rPr>
-              <w:lastRenderedPageBreak/>
-              <w:t>visualization controls</w:t>
+              <w:t>configuration, forecasting, and visualization controls</w:t>
             </w:r>
             <w:r>
               <w:rPr>
@@ -2167,6 +2190,9 @@
       <w:pPr>
         <w:pStyle w:val="Heading2"/>
       </w:pPr>
+      <w:r>
+        <w:t xml:space="preserve">3.2 </w:t>
+      </w:r>
       <w:r>
         <w:t>Non-Functional Requirements</w:t>
       </w:r>
@@ -2865,6 +2891,12 @@
         <w:jc w:val="both"/>
       </w:pPr>
       <w:r>
+        <w:t>4.</w:t>
+      </w:r>
+      <w:r>
+        <w:t xml:space="preserve">0 </w:t>
+      </w:r>
+      <w:r>
         <w:t>System Architecture and Design</w:t>
       </w:r>
     </w:p>
@@ -2908,9 +2940,31 @@
     </w:p>
     <w:p>
       <w:pPr>
+        <w:spacing w:after="160" w:line="259" w:lineRule="auto"/>
+        <w:jc w:val="left"/>
+        <w:rPr>
+          <w:rFonts w:eastAsiaTheme="majorEastAsia" w:cstheme="majorBidi"/>
+          <w:color w:val="2F5496" w:themeColor="accent1" w:themeShade="BF"/>
+          <w:kern w:val="2"/>
+          <w:sz w:val="28"/>
+          <w:szCs w:val="26"/>
+          <w:lang w:val="en-MY" w:eastAsia="zh-CN"/>
+          <w14:ligatures w14:val="standardContextual"/>
+        </w:rPr>
+      </w:pPr>
+      <w:r>
+        <w:br w:type="page"/>
+      </w:r>
+    </w:p>
+    <w:p>
+      <w:pPr>
         <w:pStyle w:val="Heading2"/>
       </w:pPr>
       <w:r>
+        <w:lastRenderedPageBreak/>
+        <w:t xml:space="preserve">4.1 </w:t>
+      </w:r>
+      <w:r>
         <w:t>High Level Architecture Pattern</w:t>
       </w:r>
     </w:p>
@@ -2966,14 +3020,7 @@
         <w:rPr>
           <w:lang w:val="en-MY" w:eastAsia="zh-CN"/>
         </w:rPr>
-        <w:t xml:space="preserve"> and produces the same structure, expended with additional </w:t>
-      </w:r>
-      <w:r>
-        <w:rPr>
-          <w:lang w:val="en-MY" w:eastAsia="zh-CN"/>
-        </w:rPr>
-        <w:lastRenderedPageBreak/>
-        <w:t xml:space="preserve">columns as its output. This </w:t>
+        <w:t xml:space="preserve"> and produces the same structure, expended with additional columns as its output. This </w:t>
       </w:r>
       <w:r>
         <w:rPr>
@@ -3114,6 +3161,9 @@
         <w:pStyle w:val="Heading2"/>
       </w:pPr>
       <w:r>
+        <w:t xml:space="preserve">4.2 </w:t>
+      </w:r>
+      <w:r>
         <w:t>Data Pipeline</w:t>
       </w:r>
     </w:p>
@@ -3237,6 +3287,9 @@
       <w:pPr>
         <w:pStyle w:val="Heading2"/>
       </w:pPr>
+      <w:r>
+        <w:t xml:space="preserve">4.3 </w:t>
+      </w:r>
       <w:r>
         <w:t>Module Overview</w:t>
       </w:r>
@@ -3552,7 +3605,7 @@
                 <w:sz w:val="20"/>
                 <w:szCs w:val="20"/>
               </w:rPr>
-              <w:t xml:space="preserve"> population to Police District boundaries, handling of non-geographic labels ("Total", "Not Specified") and district</w:t>
+              <w:t xml:space="preserve"> population to Police District boundaries, handling of non-geographic </w:t>
             </w:r>
             <w:r>
               <w:rPr>
@@ -3560,15 +3613,8 @@
                 <w:sz w:val="20"/>
                 <w:szCs w:val="20"/>
               </w:rPr>
-              <w:t xml:space="preserve"> </w:t>
-            </w:r>
-            <w:r>
-              <w:rPr>
-                <w:color w:val="000000"/>
-                <w:sz w:val="20"/>
-                <w:szCs w:val="20"/>
-              </w:rPr>
-              <w:t>name mismatches.</w:t>
+              <w:lastRenderedPageBreak/>
+              <w:t>labels ("Total", "Not Specified") and district name mismatches.</w:t>
             </w:r>
           </w:p>
         </w:tc>
@@ -3592,6 +3638,7 @@
               <w:rPr>
                 <w:lang w:val="en-MY" w:eastAsia="zh-CN"/>
               </w:rPr>
+              <w:lastRenderedPageBreak/>
               <w:t>visualize.py</w:t>
             </w:r>
           </w:p>
@@ -3733,14 +3780,7 @@
               <w:rPr>
                 <w:lang w:eastAsia="zh-CN"/>
               </w:rPr>
-              <w:t xml:space="preserve"> application integrating the above </w:t>
-            </w:r>
-            <w:r>
-              <w:rPr>
-                <w:lang w:eastAsia="zh-CN"/>
-              </w:rPr>
-              <w:lastRenderedPageBreak/>
-              <w:t xml:space="preserve">modules into an interactive interface </w:t>
+              <w:t xml:space="preserve"> application integrating the above modules into an interactive interface </w:t>
             </w:r>
             <w:r>
               <w:rPr>
@@ -3768,7 +3808,6 @@
         <w:rPr>
           <w:lang w:val="en-MY" w:eastAsia="zh-CN"/>
         </w:rPr>
-        <w:lastRenderedPageBreak/>
         <w:t xml:space="preserve"> </w:t>
       </w:r>
     </w:p>
@@ -3777,6 +3816,9 @@
         <w:pStyle w:val="Heading2"/>
       </w:pPr>
       <w:r>
+        <w:t xml:space="preserve">4.4 </w:t>
+      </w:r>
+      <w:r>
         <w:t>Key Algorithms and Technical Approaches</w:t>
       </w:r>
     </w:p>
@@ -3824,6 +3866,12 @@
           <w:lang w:val="en-MY" w:eastAsia="zh-CN"/>
         </w:rPr>
       </w:pPr>
+      <w:r>
+        <w:rPr>
+          <w:lang w:val="en-MY" w:eastAsia="zh-CN"/>
+        </w:rPr>
+        <w:t xml:space="preserve">4.4.1 </w:t>
+      </w:r>
       <w:r>
         <w:rPr>
           <w:lang w:val="en-MY" w:eastAsia="zh-CN"/>
@@ -3887,24 +3935,9 @@
           <w:szCs w:val="28"/>
           <w:lang w:val="en-MY" w:eastAsia="zh-CN"/>
         </w:rPr>
-        <w:t>Frequency-aware feature construction</w:t>
-      </w:r>
-    </w:p>
-    <w:p>
-      <w:pPr>
-        <w:rPr>
-          <w:lang w:val="en-MY" w:eastAsia="zh-CN"/>
-        </w:rPr>
-      </w:pPr>
-      <w:r>
-        <w:rPr>
-          <w:lang w:val="en-MY" w:eastAsia="zh-CN"/>
-        </w:rPr>
-        <w:t>Lag depth, rolling-window size, and whether month-of-year seasonality is encoded at all are each conditioned on the detected data frequency (annual or monthly) rather than fixed. This avoids a specific failure mode observed during development: a twelve-period lag applied to annual data would consume twelve years of history before producing a single valid value, which a fixed, frequency-blind implementation would not have caught until it silently produced an all-missing column.</w:t>
-      </w:r>
-    </w:p>
-    <w:p>
-      <w:pPr>
+        <w:t xml:space="preserve">4.4.2 </w:t>
+      </w:r>
+      <w:r>
         <w:rPr>
           <w:rFonts w:asciiTheme="minorHAnsi" w:eastAsiaTheme="majorEastAsia" w:hAnsiTheme="minorHAnsi" w:cstheme="majorBidi"/>
           <w:color w:val="8EAADB" w:themeColor="accent1" w:themeTint="99"/>
@@ -3912,7 +3945,21 @@
           <w:szCs w:val="28"/>
           <w:lang w:val="en-MY" w:eastAsia="zh-CN"/>
         </w:rPr>
-      </w:pPr>
+        <w:t>Frequency-aware feature construction</w:t>
+      </w:r>
+    </w:p>
+    <w:p>
+      <w:pPr>
+        <w:rPr>
+          <w:lang w:val="en-MY" w:eastAsia="zh-CN"/>
+        </w:rPr>
+      </w:pPr>
+      <w:r>
+        <w:rPr>
+          <w:lang w:val="en-MY" w:eastAsia="zh-CN"/>
+        </w:rPr>
+        <w:t>Lag depth, rolling-window size, and whether month-of-year seasonality is encoded at all are each conditioned on the detected data frequency (annual or monthly) rather than fixed. This avoids a specific failure mode observed during development: a twelve-period lag applied to annual data would consume twelve years of history before producing a single valid value, which a fixed, frequency-blind implementation would not have caught until it silently produced an all-missing column.</w:t>
+      </w:r>
     </w:p>
     <w:p>
       <w:pPr>
@@ -3924,7 +3971,9 @@
           <w:lang w:val="en-MY" w:eastAsia="zh-CN"/>
         </w:rPr>
       </w:pPr>
-      <w:r>
+    </w:p>
+    <w:p>
+      <w:pPr>
         <w:rPr>
           <w:rFonts w:asciiTheme="minorHAnsi" w:eastAsiaTheme="majorEastAsia" w:hAnsiTheme="minorHAnsi" w:cstheme="majorBidi"/>
           <w:color w:val="8EAADB" w:themeColor="accent1" w:themeTint="99"/>
@@ -3932,24 +3981,8 @@
           <w:szCs w:val="28"/>
           <w:lang w:val="en-MY" w:eastAsia="zh-CN"/>
         </w:rPr>
-        <w:t>Recursive multi-step forecasting</w:t>
-      </w:r>
-    </w:p>
-    <w:p>
-      <w:pPr>
-        <w:rPr>
-          <w:lang w:val="en-MY" w:eastAsia="zh-CN"/>
-        </w:rPr>
-      </w:pPr>
-      <w:r>
-        <w:rPr>
-          <w:lang w:val="en-MY" w:eastAsia="zh-CN"/>
-        </w:rPr>
-        <w:t>Because the scikit-learn model's own features depend on the immediately preceding period's value, forecasting more than one period ahead cannot be done in a single prediction call. The model instead predicts one step ahead, appends that prediction to its working history, recomputes features including the new value, and repeats — an autoregressive approach that trades some accumulated error over longer horizons for the ability to use arbitrarily rich lag-based features.</w:t>
-      </w:r>
-    </w:p>
-    <w:p>
-      <w:pPr>
+      </w:pPr>
+      <w:r>
         <w:rPr>
           <w:rFonts w:asciiTheme="minorHAnsi" w:eastAsiaTheme="majorEastAsia" w:hAnsiTheme="minorHAnsi" w:cstheme="majorBidi"/>
           <w:color w:val="8EAADB" w:themeColor="accent1" w:themeTint="99"/>
@@ -3957,10 +3990,9 @@
           <w:szCs w:val="28"/>
           <w:lang w:val="en-MY" w:eastAsia="zh-CN"/>
         </w:rPr>
-      </w:pPr>
-    </w:p>
-    <w:p>
-      <w:pPr>
+        <w:t xml:space="preserve">4.4.3 </w:t>
+      </w:r>
+      <w:r>
         <w:rPr>
           <w:rFonts w:asciiTheme="minorHAnsi" w:eastAsiaTheme="majorEastAsia" w:hAnsiTheme="minorHAnsi" w:cstheme="majorBidi"/>
           <w:color w:val="8EAADB" w:themeColor="accent1" w:themeTint="99"/>
@@ -3968,8 +4000,24 @@
           <w:szCs w:val="28"/>
           <w:lang w:val="en-MY" w:eastAsia="zh-CN"/>
         </w:rPr>
-      </w:pPr>
-      <w:r>
+        <w:t>Recursive multi-step forecasting</w:t>
+      </w:r>
+    </w:p>
+    <w:p>
+      <w:pPr>
+        <w:rPr>
+          <w:lang w:val="en-MY" w:eastAsia="zh-CN"/>
+        </w:rPr>
+      </w:pPr>
+      <w:r>
+        <w:rPr>
+          <w:lang w:val="en-MY" w:eastAsia="zh-CN"/>
+        </w:rPr>
+        <w:t>Because the scikit-learn model's own features depend on the immediately preceding period's value, forecasting more than one period ahead cannot be done in a single prediction call. The model instead predicts one step ahead, appends that prediction to its working history, recomputes features including the new value, and repeats — an autoregressive approach that trades some accumulated error over longer horizons for the ability to use arbitrarily rich lag-based features.</w:t>
+      </w:r>
+    </w:p>
+    <w:p>
+      <w:pPr>
         <w:rPr>
           <w:rFonts w:asciiTheme="minorHAnsi" w:eastAsiaTheme="majorEastAsia" w:hAnsiTheme="minorHAnsi" w:cstheme="majorBidi"/>
           <w:color w:val="8EAADB" w:themeColor="accent1" w:themeTint="99"/>
@@ -3977,56 +4025,10 @@
           <w:szCs w:val="28"/>
           <w:lang w:val="en-MY" w:eastAsia="zh-CN"/>
         </w:rPr>
-        <w:t>Walk-forward cross-validation with consistent model selection</w:t>
-      </w:r>
-    </w:p>
-    <w:p>
-      <w:pPr>
-        <w:rPr>
-          <w:lang w:val="en-MY" w:eastAsia="zh-CN"/>
-        </w:rPr>
-      </w:pPr>
-      <w:r>
-        <w:rPr>
-          <w:lang w:val="en-MY" w:eastAsia="zh-CN"/>
-        </w:rPr>
-        <w:t xml:space="preserve">Model quality is assessed using an expanding-window walk-forward scheme: training data grows and the evaluation window steps backward through several historical periods, rather than relying on a single train/test split. A specific discipline is enforced across all three modelling approaches — whatever hyperparameters are selected during tuning are the exact configuration subsequently evaluated by cross-validation, </w:t>
-      </w:r>
-      <w:proofErr w:type="spellStart"/>
-      <w:r>
-        <w:rPr>
-          <w:lang w:val="en-MY" w:eastAsia="zh-CN"/>
-        </w:rPr>
-        <w:t>backtested</w:t>
-      </w:r>
-      <w:proofErr w:type="spellEnd"/>
-      <w:r>
-        <w:rPr>
-          <w:lang w:val="en-MY" w:eastAsia="zh-CN"/>
-        </w:rPr>
-        <w:t xml:space="preserve"> on the holdout, and used for the final forecast</w:t>
-      </w:r>
-      <w:r>
-        <w:rPr>
-          <w:lang w:val="en-MY" w:eastAsia="zh-CN"/>
-        </w:rPr>
-        <w:t>.</w:t>
-      </w:r>
-    </w:p>
-    <w:p>
-      <w:pPr>
-        <w:rPr>
-          <w:lang w:val="en-MY" w:eastAsia="zh-CN"/>
-        </w:rPr>
-      </w:pPr>
-    </w:p>
-    <w:p>
-      <w:pPr>
-        <w:rPr>
-          <w:lang w:val="en-MY" w:eastAsia="zh-CN"/>
-        </w:rPr>
-      </w:pPr>
-      <w:r>
+      </w:pPr>
+    </w:p>
+    <w:p>
+      <w:pPr>
         <w:rPr>
           <w:rFonts w:asciiTheme="minorHAnsi" w:eastAsiaTheme="majorEastAsia" w:hAnsiTheme="minorHAnsi" w:cstheme="majorBidi"/>
           <w:color w:val="8EAADB" w:themeColor="accent1" w:themeTint="99"/>
@@ -4034,6 +4036,86 @@
           <w:szCs w:val="28"/>
           <w:lang w:val="en-MY" w:eastAsia="zh-CN"/>
         </w:rPr>
+      </w:pPr>
+      <w:r>
+        <w:rPr>
+          <w:rFonts w:asciiTheme="minorHAnsi" w:eastAsiaTheme="majorEastAsia" w:hAnsiTheme="minorHAnsi" w:cstheme="majorBidi"/>
+          <w:color w:val="8EAADB" w:themeColor="accent1" w:themeTint="99"/>
+          <w:sz w:val="28"/>
+          <w:szCs w:val="28"/>
+          <w:lang w:val="en-MY" w:eastAsia="zh-CN"/>
+        </w:rPr>
+        <w:t xml:space="preserve">4.4.4 </w:t>
+      </w:r>
+      <w:r>
+        <w:rPr>
+          <w:rFonts w:asciiTheme="minorHAnsi" w:eastAsiaTheme="majorEastAsia" w:hAnsiTheme="minorHAnsi" w:cstheme="majorBidi"/>
+          <w:color w:val="8EAADB" w:themeColor="accent1" w:themeTint="99"/>
+          <w:sz w:val="28"/>
+          <w:szCs w:val="28"/>
+          <w:lang w:val="en-MY" w:eastAsia="zh-CN"/>
+        </w:rPr>
+        <w:t>Walk-forward cross-validation with consistent model selection</w:t>
+      </w:r>
+    </w:p>
+    <w:p>
+      <w:pPr>
+        <w:rPr>
+          <w:lang w:val="en-MY" w:eastAsia="zh-CN"/>
+        </w:rPr>
+      </w:pPr>
+      <w:r>
+        <w:rPr>
+          <w:lang w:val="en-MY" w:eastAsia="zh-CN"/>
+        </w:rPr>
+        <w:t xml:space="preserve">Model quality is assessed using an expanding-window walk-forward scheme: training data grows and the evaluation window steps backward through several historical periods, rather than relying on a single train/test split. A specific discipline is enforced across all three modelling approaches — whatever hyperparameters are selected during tuning are the exact configuration subsequently evaluated by cross-validation, </w:t>
+      </w:r>
+      <w:proofErr w:type="spellStart"/>
+      <w:r>
+        <w:rPr>
+          <w:lang w:val="en-MY" w:eastAsia="zh-CN"/>
+        </w:rPr>
+        <w:t>backtested</w:t>
+      </w:r>
+      <w:proofErr w:type="spellEnd"/>
+      <w:r>
+        <w:rPr>
+          <w:lang w:val="en-MY" w:eastAsia="zh-CN"/>
+        </w:rPr>
+        <w:t xml:space="preserve"> on the holdout, and used for the final forecast</w:t>
+      </w:r>
+      <w:r>
+        <w:rPr>
+          <w:lang w:val="en-MY" w:eastAsia="zh-CN"/>
+        </w:rPr>
+        <w:t>.</w:t>
+      </w:r>
+    </w:p>
+    <w:p>
+      <w:pPr>
+        <w:rPr>
+          <w:lang w:val="en-MY" w:eastAsia="zh-CN"/>
+        </w:rPr>
+      </w:pPr>
+      <w:r>
+        <w:rPr>
+          <w:rFonts w:asciiTheme="minorHAnsi" w:eastAsiaTheme="majorEastAsia" w:hAnsiTheme="minorHAnsi" w:cstheme="majorBidi"/>
+          <w:color w:val="8EAADB" w:themeColor="accent1" w:themeTint="99"/>
+          <w:sz w:val="28"/>
+          <w:szCs w:val="28"/>
+          <w:lang w:val="en-MY" w:eastAsia="zh-CN"/>
+        </w:rPr>
+        <w:lastRenderedPageBreak/>
+        <w:t xml:space="preserve">4.4.5 </w:t>
+      </w:r>
+      <w:r>
+        <w:rPr>
+          <w:rFonts w:asciiTheme="minorHAnsi" w:eastAsiaTheme="majorEastAsia" w:hAnsiTheme="minorHAnsi" w:cstheme="majorBidi"/>
+          <w:color w:val="8EAADB" w:themeColor="accent1" w:themeTint="99"/>
+          <w:sz w:val="28"/>
+          <w:szCs w:val="28"/>
+          <w:lang w:val="en-MY" w:eastAsia="zh-CN"/>
+        </w:rPr>
         <w:t>Spatial join for population normalisation</w:t>
       </w:r>
     </w:p>
@@ -4055,14 +4137,7 @@
         <w:rPr>
           <w:lang w:val="en-MY" w:eastAsia="zh-CN"/>
         </w:rPr>
-        <w:t>-level population is aggregated to Police District level via a spatial join (using centroid/within predicate) rather than an attribute-based merge, since the two geographies share no common key. District-name text matching elsewhere in the pipeline uses a case-</w:t>
-      </w:r>
-      <w:r>
-        <w:rPr>
-          <w:lang w:val="en-MY" w:eastAsia="zh-CN"/>
-        </w:rPr>
-        <w:lastRenderedPageBreak/>
-        <w:t>folded, diacritic-stripped comparison rather than exact string equality, to tolerate the same class of formatting inconsistency observed between different data sources.</w:t>
+        <w:t>-level population is aggregated to Police District level via a spatial join (using centroid/within predicate) rather than an attribute-based merge, since the two geographies share no common key. District-name text matching elsewhere in the pipeline uses a case-folded, diacritic-stripped comparison rather than exact string equality, to tolerate the same class of formatting inconsistency observed between different data sources.</w:t>
       </w:r>
     </w:p>
     <w:p>
@@ -4082,6 +4157,9 @@
       <w:pPr>
         <w:pStyle w:val="Heading2"/>
       </w:pPr>
+      <w:r>
+        <w:t xml:space="preserve">4.5 </w:t>
+      </w:r>
       <w:r>
         <w:t>Technology Stack</w:t>
       </w:r>
@@ -4542,6 +4620,9 @@
         <w:pStyle w:val="Heading2"/>
       </w:pPr>
       <w:r>
+        <w:t xml:space="preserve">4.6 </w:t>
+      </w:r>
+      <w:r>
         <w:t>Design Rationale</w:t>
       </w:r>
     </w:p>
@@ -4693,6 +4774,9 @@
         <w:jc w:val="both"/>
       </w:pPr>
       <w:r>
+        <w:t xml:space="preserve">5.0 </w:t>
+      </w:r>
+      <w:r>
         <w:t>Implementation Details</w:t>
       </w:r>
     </w:p>
@@ -4701,6 +4785,9 @@
         <w:pStyle w:val="Heading2"/>
       </w:pPr>
       <w:r>
+        <w:t xml:space="preserve">5.1 </w:t>
+      </w:r>
+      <w:r>
         <w:t>Module Descriptions and Workflows</w:t>
       </w:r>
     </w:p>
@@ -4719,11 +4806,49 @@
     </w:p>
     <w:p>
       <w:pPr>
+        <w:spacing w:after="160" w:line="259" w:lineRule="auto"/>
+        <w:jc w:val="left"/>
+        <w:rPr>
+          <w:rFonts w:asciiTheme="minorHAnsi" w:eastAsiaTheme="majorEastAsia" w:hAnsiTheme="minorHAnsi" w:cstheme="majorBidi"/>
+          <w:color w:val="8EAADB" w:themeColor="accent1" w:themeTint="99"/>
+          <w:sz w:val="28"/>
+          <w:szCs w:val="28"/>
+          <w:lang w:val="en-MY" w:eastAsia="zh-CN"/>
+        </w:rPr>
+      </w:pPr>
+      <w:r>
+        <w:rPr>
+          <w:lang w:val="en-MY" w:eastAsia="zh-CN"/>
+        </w:rPr>
+        <w:br w:type="page"/>
+      </w:r>
+    </w:p>
+    <w:p>
+      <w:pPr>
         <w:pStyle w:val="Heading3"/>
         <w:rPr>
           <w:lang w:val="en-MY" w:eastAsia="zh-CN"/>
         </w:rPr>
       </w:pPr>
+      <w:r>
+        <w:rPr>
+          <w:lang w:val="en-MY" w:eastAsia="zh-CN"/>
+        </w:rPr>
+        <w:lastRenderedPageBreak/>
+        <w:t>5.</w:t>
+      </w:r>
+      <w:r>
+        <w:rPr>
+          <w:lang w:val="en-MY" w:eastAsia="zh-CN"/>
+        </w:rPr>
+        <w:t>1.1</w:t>
+      </w:r>
+      <w:r>
+        <w:rPr>
+          <w:lang w:val="en-MY" w:eastAsia="zh-CN"/>
+        </w:rPr>
+        <w:t xml:space="preserve"> </w:t>
+      </w:r>
       <w:r>
         <w:rPr>
           <w:lang w:val="en-MY" w:eastAsia="zh-CN"/>
@@ -4795,126 +4920,277 @@
         <w:rPr>
           <w:lang w:val="en-MY" w:eastAsia="zh-CN"/>
         </w:rPr>
+        <w:t>Stacked three-row header — a year row, a redundant quarter row, and a month row (containing the district-column label itself) spread across the first several data rows rather than sitting in the CSV header line.</w:t>
+      </w:r>
+    </w:p>
+    <w:p>
+      <w:pPr>
+        <w:rPr>
+          <w:lang w:val="en-MY" w:eastAsia="zh-CN"/>
+        </w:rPr>
+      </w:pPr>
+    </w:p>
+    <w:p>
+      <w:pPr>
+        <w:rPr>
+          <w:lang w:val="en-MY" w:eastAsia="zh-CN"/>
+        </w:rPr>
+      </w:pPr>
+      <w:r>
+        <w:rPr>
+          <w:lang w:val="en-MY" w:eastAsia="zh-CN"/>
+        </w:rPr>
+        <w:t>data_loader</w:t>
+      </w:r>
+      <w:r>
+        <w:rPr>
+          <w:lang w:val="en-MY" w:eastAsia="zh-CN"/>
+        </w:rPr>
+        <w:t xml:space="preserve">.py handles all three without requiring the caller to specify which layout is in use. Period columns are detected by content (a regular expression for bare years, and an explicit </w:t>
+      </w:r>
+      <w:r>
+        <w:rPr>
+          <w:lang w:val="en-MY" w:eastAsia="zh-CN"/>
+        </w:rPr>
+        <w:t>rename for</w:t>
+      </w:r>
+      <w:r>
+        <w:rPr>
+          <w:lang w:val="en-MY" w:eastAsia="zh-CN"/>
+        </w:rPr>
+        <w:t xml:space="preserve"> "Sept" irregularity) and the </w:t>
+      </w:r>
+      <w:r>
+        <w:rPr>
+          <w:lang w:val="en-MY" w:eastAsia="zh-CN"/>
+        </w:rPr>
+        <w:t>main</w:t>
+      </w:r>
+      <w:r>
+        <w:rPr>
+          <w:lang w:val="en-MY" w:eastAsia="zh-CN"/>
+        </w:rPr>
+        <w:t xml:space="preserve"> column is detected by scanning for a column name containing </w:t>
+      </w:r>
+      <w:r>
+        <w:rPr>
+          <w:lang w:val="en-MY" w:eastAsia="zh-CN"/>
+        </w:rPr>
+        <w:t>the predefined column name</w:t>
+      </w:r>
+      <w:r>
+        <w:rPr>
+          <w:lang w:val="en-MY" w:eastAsia="zh-CN"/>
+        </w:rPr>
+        <w:t xml:space="preserve">. The stacked-header case is handled by </w:t>
+      </w:r>
+      <w:r>
+        <w:rPr>
+          <w:lang w:val="en-MY" w:eastAsia="zh-CN"/>
+        </w:rPr>
+        <w:t>scanning</w:t>
+      </w:r>
+      <w:r>
+        <w:rPr>
+          <w:lang w:val="en-MY" w:eastAsia="zh-CN"/>
+        </w:rPr>
+        <w:t xml:space="preserve"> the f</w:t>
+      </w:r>
+      <w:r>
+        <w:rPr>
+          <w:lang w:val="en-MY" w:eastAsia="zh-CN"/>
+        </w:rPr>
+        <w:t>irst several rows,</w:t>
+      </w:r>
+      <w:r>
+        <w:rPr>
+          <w:lang w:val="en-MY" w:eastAsia="zh-CN"/>
+        </w:rPr>
+        <w:t xml:space="preserve"> for one that is mostly four-digit years and one that is mostly month names, and reconstructs single-row column headers (e.g. "Apr2018") from them.</w:t>
+      </w:r>
+    </w:p>
+    <w:p>
+      <w:pPr>
+        <w:rPr>
+          <w:lang w:val="en-MY" w:eastAsia="zh-CN"/>
+        </w:rPr>
+      </w:pPr>
+    </w:p>
+    <w:p>
+      <w:pPr>
+        <w:rPr>
+          <w:lang w:val="en-MY" w:eastAsia="zh-CN"/>
+        </w:rPr>
+      </w:pPr>
+      <w:r>
+        <w:rPr>
+          <w:lang w:val="en-MY" w:eastAsia="zh-CN"/>
+        </w:rPr>
+        <w:t>A recurring category of defect was numeric formatting: exported counts frequently include thousands-separator commas (e.g. "10,000")</w:t>
+      </w:r>
+      <w:r>
+        <w:rPr>
+          <w:lang w:val="en-MY" w:eastAsia="zh-CN"/>
+        </w:rPr>
+        <w:t>.</w:t>
+      </w:r>
+      <w:r>
+        <w:rPr>
+          <w:lang w:val="en-MY" w:eastAsia="zh-CN"/>
+        </w:rPr>
+        <w:t xml:space="preserve"> The cleaning layer strips separators</w:t>
+      </w:r>
+      <w:r>
+        <w:rPr>
+          <w:lang w:val="en-MY" w:eastAsia="zh-CN"/>
+        </w:rPr>
+        <w:t xml:space="preserve"> </w:t>
+      </w:r>
+      <w:r>
+        <w:rPr>
+          <w:lang w:val="en-MY" w:eastAsia="zh-CN"/>
+        </w:rPr>
+        <w:t xml:space="preserve">and converts cleaned values to pandas' nullable Int64 </w:t>
+      </w:r>
+      <w:proofErr w:type="spellStart"/>
+      <w:r>
+        <w:rPr>
+          <w:lang w:val="en-MY" w:eastAsia="zh-CN"/>
+        </w:rPr>
+        <w:t>dtype</w:t>
+      </w:r>
+      <w:proofErr w:type="spellEnd"/>
+      <w:r>
+        <w:rPr>
+          <w:lang w:val="en-MY" w:eastAsia="zh-CN"/>
+        </w:rPr>
+        <w:t xml:space="preserve"> so that missing values are preserved rather than forcing an unwanted fallback to floating point.</w:t>
+      </w:r>
+    </w:p>
+    <w:p>
+      <w:pPr>
+        <w:pStyle w:val="Heading3"/>
+        <w:rPr>
+          <w:lang w:val="en-MY" w:eastAsia="zh-CN"/>
+        </w:rPr>
+      </w:pPr>
+      <w:r>
+        <w:rPr>
+          <w:lang w:val="en-MY" w:eastAsia="zh-CN"/>
+        </w:rPr>
+        <w:t>5.</w:t>
+      </w:r>
+      <w:r>
+        <w:rPr>
+          <w:lang w:val="en-MY" w:eastAsia="zh-CN"/>
+        </w:rPr>
+        <w:t>1.2</w:t>
+      </w:r>
+      <w:r>
+        <w:rPr>
+          <w:lang w:val="en-MY" w:eastAsia="zh-CN"/>
+        </w:rPr>
+        <w:t xml:space="preserve"> </w:t>
+      </w:r>
+      <w:r>
+        <w:rPr>
+          <w:lang w:val="en-MY" w:eastAsia="zh-CN"/>
+        </w:rPr>
+        <w:t>Feature Engineering</w:t>
+      </w:r>
+    </w:p>
+    <w:p>
+      <w:pPr>
+        <w:rPr>
+          <w:lang w:val="en-MY" w:eastAsia="zh-CN"/>
+        </w:rPr>
+      </w:pPr>
+      <w:proofErr w:type="spellStart"/>
+      <w:r>
+        <w:rPr>
+          <w:lang w:val="en-MY" w:eastAsia="zh-CN"/>
+        </w:rPr>
+        <w:t>build_features</w:t>
+      </w:r>
+      <w:proofErr w:type="spellEnd"/>
+      <w:r>
+        <w:rPr>
+          <w:lang w:val="en-MY" w:eastAsia="zh-CN"/>
+        </w:rPr>
+        <w:t>() constructs lag values (1, 2, 3, and — for monthly data only — 6 and 12 periods back), trailing rolling mean/standard-deviation/min/max statistics, a cyclical month-of-year encoding (sine/cosine, to avoid an artificial December-to-January discontinuity), and a simple time index</w:t>
+      </w:r>
+      <w:r>
+        <w:rPr>
+          <w:lang w:val="en-MY" w:eastAsia="zh-CN"/>
+        </w:rPr>
+        <w:t xml:space="preserve"> </w:t>
+      </w:r>
+      <w:r>
+        <w:rPr>
+          <w:lang w:val="en-MY" w:eastAsia="zh-CN"/>
+        </w:rPr>
+        <w:t>after reshaping wide-to-long data format</w:t>
+      </w:r>
+      <w:r>
+        <w:rPr>
+          <w:lang w:val="en-MY" w:eastAsia="zh-CN"/>
+        </w:rPr>
+        <w:t>. Feature construction is frequency-aware: annual data uses shorter lag/rolling windows and omits month-of-year encoding entirely, since a 12-year annual series cannot support a 12-period lag without producing an all-missing column, and a single annual observation has no within-year seasonality to encode.</w:t>
+      </w:r>
+    </w:p>
+    <w:p>
+      <w:pPr>
+        <w:rPr>
+          <w:lang w:val="en-MY" w:eastAsia="zh-CN"/>
+        </w:rPr>
+      </w:pPr>
+    </w:p>
+    <w:p>
+      <w:pPr>
+        <w:rPr>
+          <w:lang w:val="en-MY" w:eastAsia="zh-CN"/>
+        </w:rPr>
+      </w:pPr>
+      <w:r>
+        <w:rPr>
+          <w:lang w:val="en-MY" w:eastAsia="zh-CN"/>
+        </w:rPr>
+        <w:t xml:space="preserve">A specific defect was identified and corrected in this layer during testing: two derived columns (period-over-period difference, and a year-over-year ratio) were initially included as model inputs despite being computed from the current period's own count value. Because these columns are mathematically a function of the value being forecast, including them constitutes target leakage — the model could appear artificially accurate during </w:t>
+      </w:r>
+      <w:proofErr w:type="spellStart"/>
+      <w:r>
+        <w:rPr>
+          <w:lang w:val="en-MY" w:eastAsia="zh-CN"/>
+        </w:rPr>
+        <w:t>backtesting</w:t>
+      </w:r>
+      <w:proofErr w:type="spellEnd"/>
+      <w:r>
+        <w:rPr>
+          <w:lang w:val="en-MY" w:eastAsia="zh-CN"/>
+        </w:rPr>
+        <w:t xml:space="preserve"> while being unable to compute the same feature for a genuinely unknown future period. This was caught because it caused the recursive forecasting loop (described below) to fail with propagated missing values, and was corrected by excluding all such derived columns from the trainable feature set.</w:t>
+      </w:r>
+    </w:p>
+    <w:p>
+      <w:pPr>
+        <w:pStyle w:val="Heading3"/>
+        <w:rPr>
+          <w:lang w:val="en-MY" w:eastAsia="zh-CN"/>
+        </w:rPr>
+      </w:pPr>
+      <w:r>
+        <w:rPr>
+          <w:lang w:val="en-MY" w:eastAsia="zh-CN"/>
+        </w:rPr>
         <w:lastRenderedPageBreak/>
-        <w:t>Stacked three-row header — a year row, a redundant quarter row, and a month row (containing the district-column label itself) spread across the first several data rows rather than sitting in the CSV header line.</w:t>
-      </w:r>
-    </w:p>
-    <w:p>
-      <w:pPr>
-        <w:rPr>
-          <w:lang w:val="en-MY" w:eastAsia="zh-CN"/>
-        </w:rPr>
-      </w:pPr>
-    </w:p>
-    <w:p>
-      <w:pPr>
-        <w:rPr>
-          <w:lang w:val="en-MY" w:eastAsia="zh-CN"/>
-        </w:rPr>
-      </w:pPr>
-      <w:r>
-        <w:rPr>
-          <w:lang w:val="en-MY" w:eastAsia="zh-CN"/>
-        </w:rPr>
-        <w:t>data_loader</w:t>
-      </w:r>
-      <w:r>
-        <w:rPr>
-          <w:lang w:val="en-MY" w:eastAsia="zh-CN"/>
-        </w:rPr>
-        <w:t xml:space="preserve">.py handles all three without requiring the caller to specify which layout is in use. Period columns are detected by content (a regular expression for bare years, and an explicit </w:t>
-      </w:r>
-      <w:r>
-        <w:rPr>
-          <w:lang w:val="en-MY" w:eastAsia="zh-CN"/>
-        </w:rPr>
-        <w:t>rename for</w:t>
-      </w:r>
-      <w:r>
-        <w:rPr>
-          <w:lang w:val="en-MY" w:eastAsia="zh-CN"/>
-        </w:rPr>
-        <w:t xml:space="preserve"> "Sept" irregularity) and the </w:t>
-      </w:r>
-      <w:r>
-        <w:rPr>
-          <w:lang w:val="en-MY" w:eastAsia="zh-CN"/>
-        </w:rPr>
-        <w:t>main</w:t>
-      </w:r>
-      <w:r>
-        <w:rPr>
-          <w:lang w:val="en-MY" w:eastAsia="zh-CN"/>
-        </w:rPr>
-        <w:t xml:space="preserve"> column is detected by scanning for a column name containing </w:t>
-      </w:r>
-      <w:r>
-        <w:rPr>
-          <w:lang w:val="en-MY" w:eastAsia="zh-CN"/>
-        </w:rPr>
-        <w:t>the predefined column name</w:t>
-      </w:r>
-      <w:r>
-        <w:rPr>
-          <w:lang w:val="en-MY" w:eastAsia="zh-CN"/>
-        </w:rPr>
-        <w:t xml:space="preserve">. The stacked-header case is handled by </w:t>
-      </w:r>
-      <w:r>
-        <w:rPr>
-          <w:lang w:val="en-MY" w:eastAsia="zh-CN"/>
-        </w:rPr>
-        <w:t>scanning</w:t>
-      </w:r>
-      <w:r>
-        <w:rPr>
-          <w:lang w:val="en-MY" w:eastAsia="zh-CN"/>
-        </w:rPr>
-        <w:t xml:space="preserve"> the f</w:t>
-      </w:r>
-      <w:r>
-        <w:rPr>
-          <w:lang w:val="en-MY" w:eastAsia="zh-CN"/>
-        </w:rPr>
-        <w:t>irst several rows,</w:t>
-      </w:r>
-      <w:r>
-        <w:rPr>
-          <w:lang w:val="en-MY" w:eastAsia="zh-CN"/>
-        </w:rPr>
-        <w:t xml:space="preserve"> for one that is mostly four-digit years and one that is mostly month names, and reconstructs single-row column headers (e.g. "Apr2018") from them.</w:t>
-      </w:r>
-    </w:p>
-    <w:p>
-      <w:pPr>
-        <w:rPr>
-          <w:lang w:val="en-MY" w:eastAsia="zh-CN"/>
-        </w:rPr>
-      </w:pPr>
-    </w:p>
-    <w:p>
-      <w:pPr>
-        <w:rPr>
-          <w:lang w:val="en-MY" w:eastAsia="zh-CN"/>
-        </w:rPr>
-      </w:pPr>
-      <w:r>
-        <w:rPr>
-          <w:lang w:val="en-MY" w:eastAsia="zh-CN"/>
-        </w:rPr>
-        <w:t>A recurring category of defect was numeric formatting: exported counts frequently include thousands-separator commas (e.g. "10,000")</w:t>
-      </w:r>
-      <w:r>
-        <w:rPr>
-          <w:lang w:val="en-MY" w:eastAsia="zh-CN"/>
-        </w:rPr>
-        <w:t>.</w:t>
-      </w:r>
-      <w:r>
-        <w:rPr>
-          <w:lang w:val="en-MY" w:eastAsia="zh-CN"/>
-        </w:rPr>
-        <w:t xml:space="preserve"> The cleaning layer strips separators</w:t>
+        <w:t>5.</w:t>
+      </w:r>
+      <w:r>
+        <w:rPr>
+          <w:lang w:val="en-MY" w:eastAsia="zh-CN"/>
+        </w:rPr>
+        <w:t>1.3</w:t>
       </w:r>
       <w:r>
         <w:rPr>
@@ -4926,21 +5202,157 @@
         <w:rPr>
           <w:lang w:val="en-MY" w:eastAsia="zh-CN"/>
         </w:rPr>
-        <w:t xml:space="preserve">and converts cleaned values to pandas' nullable Int64 </w:t>
+        <w:t>Forecasting Models</w:t>
+      </w:r>
+    </w:p>
+    <w:p>
+      <w:pPr>
+        <w:pStyle w:val="Heading4"/>
+        <w:rPr>
+          <w:lang w:val="en-MY" w:eastAsia="zh-CN"/>
+        </w:rPr>
+      </w:pPr>
+      <w:r>
+        <w:rPr>
+          <w:lang w:val="en-MY" w:eastAsia="zh-CN"/>
+        </w:rPr>
+        <w:t>Scikit-learn regressor with recursive forecasting</w:t>
+      </w:r>
+    </w:p>
+    <w:p>
+      <w:pPr>
+        <w:rPr>
+          <w:lang w:val="en-MY" w:eastAsia="zh-CN"/>
+        </w:rPr>
+      </w:pPr>
+      <w:r>
+        <w:rPr>
+          <w:lang w:val="en-MY" w:eastAsia="zh-CN"/>
+        </w:rPr>
+        <w:t xml:space="preserve">A </w:t>
       </w:r>
       <w:proofErr w:type="spellStart"/>
       <w:r>
         <w:rPr>
           <w:lang w:val="en-MY" w:eastAsia="zh-CN"/>
         </w:rPr>
-        <w:t>dtype</w:t>
+        <w:t>GradientBoostingRegressor</w:t>
       </w:r>
       <w:proofErr w:type="spellEnd"/>
       <w:r>
         <w:rPr>
           <w:lang w:val="en-MY" w:eastAsia="zh-CN"/>
         </w:rPr>
-        <w:t xml:space="preserve"> so that missing values are preserved rather than forcing an unwanted fallback to floating point.</w:t>
+        <w:t xml:space="preserve"> (or any user-supplied scikit-learn-compatible regressor) is trained on the engineered feature set. Because features such as lag_1 depend on the immediately preceding period's actual count, multi-step-ahead forecasting is performed recursively: the model predicts one step ahead, that prediction is appended to the working history, features are recomputed including the new (predicted) value, and the next step is predicted from that — repeated for the requested forecast horizon.</w:t>
+      </w:r>
+    </w:p>
+    <w:p>
+      <w:pPr>
+        <w:pStyle w:val="Heading4"/>
+        <w:rPr>
+          <w:lang w:val="en-MY" w:eastAsia="zh-CN"/>
+        </w:rPr>
+      </w:pPr>
+      <w:r>
+        <w:rPr>
+          <w:lang w:val="en-MY" w:eastAsia="zh-CN"/>
+        </w:rPr>
+        <w:t>Prophet</w:t>
+      </w:r>
+    </w:p>
+    <w:p>
+      <w:pPr>
+        <w:rPr>
+          <w:lang w:val="en-MY" w:eastAsia="zh-CN"/>
+        </w:rPr>
+      </w:pPr>
+      <w:r>
+        <w:rPr>
+          <w:lang w:val="en-MY" w:eastAsia="zh-CN"/>
+        </w:rPr>
+        <w:t>Prophet is fitted directly on the (date, count) series without the engineered lag features, since it constructs its own trend and seasonality decomposition internally. A small grid search over Prophet's own hyperparameters (changepoint flexibility, seasonality strength, and additive vs multiplicative seasonality) is scored using the same walk-forward cross-validation standard used elsewhere.</w:t>
+      </w:r>
+    </w:p>
+    <w:p>
+      <w:pPr>
+        <w:pStyle w:val="Heading4"/>
+        <w:rPr>
+          <w:lang w:val="en-MY" w:eastAsia="zh-CN"/>
+        </w:rPr>
+      </w:pPr>
+      <w:proofErr w:type="spellStart"/>
+      <w:r>
+        <w:rPr>
+          <w:lang w:val="en-MY" w:eastAsia="zh-CN"/>
+        </w:rPr>
+        <w:t>S</w:t>
+      </w:r>
+      <w:r>
+        <w:rPr>
+          <w:lang w:val="en-MY" w:eastAsia="zh-CN"/>
+        </w:rPr>
+        <w:t>tatsmodels</w:t>
+      </w:r>
+      <w:proofErr w:type="spellEnd"/>
+      <w:r>
+        <w:rPr>
+          <w:lang w:val="en-MY" w:eastAsia="zh-CN"/>
+        </w:rPr>
+        <w:t xml:space="preserve"> — Exponential Smoothing and SARIMA</w:t>
+      </w:r>
+    </w:p>
+    <w:p>
+      <w:pPr>
+        <w:rPr>
+          <w:lang w:val="en-MY" w:eastAsia="zh-CN"/>
+        </w:rPr>
+      </w:pPr>
+      <w:r>
+        <w:rPr>
+          <w:lang w:val="en-MY" w:eastAsia="zh-CN"/>
+        </w:rPr>
+        <w:t>Both an additive Exponential Smoothing (ETS) model and a seasonal ARIMA (SARIMA) model are supported, selected by a method flag. As with Prophet, a small grid search over each method's own parameters (trend/damping/seasonal form for ETS; ARIMA order and seasonal order for SARIMA) is scored via walk-forward cross-validation.</w:t>
+      </w:r>
+    </w:p>
+    <w:p>
+      <w:pPr>
+        <w:pStyle w:val="Heading4"/>
+        <w:rPr>
+          <w:lang w:val="en-MY" w:eastAsia="zh-CN"/>
+        </w:rPr>
+      </w:pPr>
+      <w:r>
+        <w:rPr>
+          <w:lang w:val="en-MY" w:eastAsia="zh-CN"/>
+        </w:rPr>
+        <w:t>Common evaluation standard</w:t>
+      </w:r>
+    </w:p>
+    <w:p>
+      <w:pPr>
+        <w:rPr>
+          <w:lang w:val="en-MY" w:eastAsia="zh-CN"/>
+        </w:rPr>
+      </w:pPr>
+      <w:r>
+        <w:rPr>
+          <w:lang w:val="en-MY" w:eastAsia="zh-CN"/>
+        </w:rPr>
+        <w:t xml:space="preserve">All three approaches share the same evaluation contract: an optional log1p target transform (to stabilise variance), an expanding-window walk-forward cross-validation with a configurable number of folds, and a single final holdout split. A model-selection utility allows the user to choose from Linear Regression, SVR, k-Nearest Neighbours, Random Forest, Gradient Boosting, Prophet, and both </w:t>
+      </w:r>
+      <w:proofErr w:type="spellStart"/>
+      <w:r>
+        <w:rPr>
+          <w:lang w:val="en-MY" w:eastAsia="zh-CN"/>
+        </w:rPr>
+        <w:t>statsmodels</w:t>
+      </w:r>
+      <w:proofErr w:type="spellEnd"/>
+      <w:r>
+        <w:rPr>
+          <w:lang w:val="en-MY" w:eastAsia="zh-CN"/>
+        </w:rPr>
+        <w:t xml:space="preserve"> variants through one common interface.</w:t>
       </w:r>
     </w:p>
     <w:p>
@@ -4954,42 +5366,209 @@
         <w:rPr>
           <w:lang w:val="en-MY" w:eastAsia="zh-CN"/>
         </w:rPr>
-        <w:t>Feature Engineering</w:t>
-      </w:r>
-    </w:p>
-    <w:p>
-      <w:pPr>
-        <w:rPr>
-          <w:lang w:val="en-MY" w:eastAsia="zh-CN"/>
-        </w:rPr>
-      </w:pPr>
+        <w:t xml:space="preserve">5.1.4 </w:t>
+      </w:r>
+      <w:r>
+        <w:rPr>
+          <w:lang w:val="en-MY" w:eastAsia="zh-CN"/>
+        </w:rPr>
+        <w:t>Population Normalisation</w:t>
+      </w:r>
+    </w:p>
+    <w:p>
+      <w:pPr>
+        <w:rPr>
+          <w:lang w:val="en-MY" w:eastAsia="zh-CN"/>
+        </w:rPr>
+      </w:pPr>
+      <w:r>
+        <w:rPr>
+          <w:lang w:val="en-MY" w:eastAsia="zh-CN"/>
+        </w:rPr>
+        <w:t xml:space="preserve">The </w:t>
+      </w:r>
+      <w:r>
+        <w:rPr>
+          <w:lang w:val="en-MY" w:eastAsia="zh-CN"/>
+        </w:rPr>
+        <w:t xml:space="preserve">boundary_loader.py performs a spatial join between Stats NZ 2023 </w:t>
+      </w:r>
       <w:proofErr w:type="spellStart"/>
       <w:r>
         <w:rPr>
           <w:lang w:val="en-MY" w:eastAsia="zh-CN"/>
         </w:rPr>
-        <w:t>build_</w:t>
-      </w:r>
-      <w:proofErr w:type="gramStart"/>
-      <w:r>
-        <w:rPr>
-          <w:lang w:val="en-MY" w:eastAsia="zh-CN"/>
-        </w:rPr>
-        <w:t>features</w:t>
+        <w:t>meshblock</w:t>
       </w:r>
       <w:proofErr w:type="spellEnd"/>
       <w:r>
         <w:rPr>
           <w:lang w:val="en-MY" w:eastAsia="zh-CN"/>
         </w:rPr>
-        <w:t>(</w:t>
-      </w:r>
-      <w:proofErr w:type="gramEnd"/>
-      <w:r>
-        <w:rPr>
-          <w:lang w:val="en-MY" w:eastAsia="zh-CN"/>
-        </w:rPr>
-        <w:t>) constructs lag values (1, 2, 3, and — for monthly data only — 6 and 12 periods back), trailing rolling mean/standard-deviation/min/max statistics, a cyclical month-of-year encoding (sine/cosine, to avoid an artificial December-to-January discontinuity), and a simple time index</w:t>
+        <w:t xml:space="preserve"> population data and Police District boundary polygons, since the two geographies do not share a common attribute key. </w:t>
+      </w:r>
+      <w:r>
+        <w:rPr>
+          <w:lang w:val="en-MY" w:eastAsia="zh-CN"/>
+        </w:rPr>
+        <w:t>The are joined through</w:t>
+      </w:r>
+      <w:r>
+        <w:rPr>
+          <w:lang w:val="en-MY" w:eastAsia="zh-CN"/>
+        </w:rPr>
+        <w:t xml:space="preserve"> a centroid/within join (each </w:t>
+      </w:r>
+      <w:proofErr w:type="spellStart"/>
+      <w:r>
+        <w:rPr>
+          <w:lang w:val="en-MY" w:eastAsia="zh-CN"/>
+        </w:rPr>
+        <w:t>meshblock</w:t>
+      </w:r>
+      <w:proofErr w:type="spellEnd"/>
+      <w:r>
+        <w:rPr>
+          <w:lang w:val="en-MY" w:eastAsia="zh-CN"/>
+        </w:rPr>
+        <w:t xml:space="preserve"> is attributed to exactly one district). The implementation flags, rather than silently ignores, the number of </w:t>
+      </w:r>
+      <w:proofErr w:type="spellStart"/>
+      <w:r>
+        <w:rPr>
+          <w:lang w:val="en-MY" w:eastAsia="zh-CN"/>
+        </w:rPr>
+        <w:t>meshblocks</w:t>
+      </w:r>
+      <w:proofErr w:type="spellEnd"/>
+      <w:r>
+        <w:rPr>
+          <w:lang w:val="en-MY" w:eastAsia="zh-CN"/>
+        </w:rPr>
+        <w:t xml:space="preserve"> matched to more than one district under the intersects predicate, so that the practical extent of any double-counting can be assessed rather than assumed.</w:t>
+      </w:r>
+    </w:p>
+    <w:p>
+      <w:pPr>
+        <w:rPr>
+          <w:lang w:val="en-MY" w:eastAsia="zh-CN"/>
+        </w:rPr>
+      </w:pPr>
+    </w:p>
+    <w:p>
+      <w:pPr>
+        <w:rPr>
+          <w:lang w:val="en-MY" w:eastAsia="zh-CN"/>
+        </w:rPr>
+      </w:pPr>
+      <w:r>
+        <w:rPr>
+          <w:lang w:val="en-MY" w:eastAsia="zh-CN"/>
+        </w:rPr>
+        <w:t xml:space="preserve">District names required normalisation for </w:t>
+      </w:r>
+      <w:r>
+        <w:rPr>
+          <w:lang w:val="en-MY" w:eastAsia="zh-CN"/>
+        </w:rPr>
+        <w:t xml:space="preserve">a major </w:t>
+      </w:r>
+      <w:proofErr w:type="spellStart"/>
+      <w:r>
+        <w:rPr>
+          <w:lang w:val="en-MY" w:eastAsia="zh-CN"/>
+        </w:rPr>
+        <w:t>reson</w:t>
+      </w:r>
+      <w:proofErr w:type="spellEnd"/>
+      <w:r>
+        <w:rPr>
+          <w:lang w:val="en-MY" w:eastAsia="zh-CN"/>
+        </w:rPr>
+        <w:t>: inconsistent capitalisation (e.g. "Bay Of Plenty" vs "Bay of Plenty"</w:t>
+      </w:r>
+      <w:r>
+        <w:rPr>
+          <w:lang w:val="en-MY" w:eastAsia="zh-CN"/>
+        </w:rPr>
+        <w:t xml:space="preserve">, however, we could not remove the possibilities of having macron differences in district naming </w:t>
+      </w:r>
+      <w:r>
+        <w:rPr>
+          <w:lang w:val="en-MY" w:eastAsia="zh-CN"/>
+        </w:rPr>
+        <w:t>(e.g. "</w:t>
+      </w:r>
+      <w:proofErr w:type="spellStart"/>
+      <w:r>
+        <w:rPr>
+          <w:lang w:val="en-MY" w:eastAsia="zh-CN"/>
+        </w:rPr>
+        <w:t>Waitematā</w:t>
+      </w:r>
+      <w:proofErr w:type="spellEnd"/>
+      <w:r>
+        <w:rPr>
+          <w:lang w:val="en-MY" w:eastAsia="zh-CN"/>
+        </w:rPr>
+        <w:t xml:space="preserve">" vs "Waitemata") — the </w:t>
+      </w:r>
+      <w:r>
+        <w:rPr>
+          <w:lang w:val="en-MY" w:eastAsia="zh-CN"/>
+        </w:rPr>
+        <w:t>former</w:t>
+      </w:r>
+      <w:r>
+        <w:rPr>
+          <w:lang w:val="en-MY" w:eastAsia="zh-CN"/>
+        </w:rPr>
+        <w:t xml:space="preserve"> from the shapefile attribute table, the </w:t>
+      </w:r>
+      <w:r>
+        <w:rPr>
+          <w:lang w:val="en-MY" w:eastAsia="zh-CN"/>
+        </w:rPr>
+        <w:t>latter</w:t>
+      </w:r>
+      <w:r>
+        <w:rPr>
+          <w:lang w:val="en-MY" w:eastAsia="zh-CN"/>
+        </w:rPr>
+        <w:t xml:space="preserve"> from a crime export). Both are resolved by matching on a case-folded, diacritic-stripped key rather than an exact string match, which also protects against future districts exhibiting the same class of mismatch. Non-geographic labels — "Not Specified" (dropped, since there is no real geography to attribute population to) and "Total" </w:t>
+      </w:r>
+      <w:r>
+        <w:rPr>
+          <w:lang w:val="en-MY" w:eastAsia="zh-CN"/>
+        </w:rPr>
+        <w:lastRenderedPageBreak/>
+        <w:t>(assigned a population equal to the sum of every real district, so its derived rate remains meaningful) — are resolved explicitly rather than left as unmatched rows.</w:t>
+      </w:r>
+    </w:p>
+    <w:p>
+      <w:pPr>
+        <w:rPr>
+          <w:lang w:val="en-MY" w:eastAsia="zh-CN"/>
+        </w:rPr>
+      </w:pPr>
+    </w:p>
+    <w:p>
+      <w:pPr>
+        <w:rPr>
+          <w:lang w:val="en-MY" w:eastAsia="zh-CN"/>
+        </w:rPr>
+      </w:pPr>
+      <w:r>
+        <w:rPr>
+          <w:lang w:val="en-MY" w:eastAsia="zh-CN"/>
+        </w:rPr>
+        <w:t xml:space="preserve">A methodological point worth recording explicitly: the available population data is a single 2023 snapshot rather than a year-by-year time series. Dividing every year's crime count by the same constant population figure rescales the series without changing its shape — meaning that, given the currently available data, forecasting the per-capita rate directly and forecasting the raw count and converting afterward are mathematically equivalent. The system therefore forecasts raw counts and derives rates as a reporting-layer conversion, and notes that this would change if genuinely time-varying population estimates (which Stats NZ does publish for non-census years, at Territorial Authority level) </w:t>
+      </w:r>
+      <w:r>
+        <w:rPr>
+          <w:lang w:val="en-MY" w:eastAsia="zh-CN"/>
+        </w:rPr>
+        <w:t>are</w:t>
       </w:r>
       <w:r>
         <w:rPr>
@@ -5001,47 +5580,13 @@
         <w:rPr>
           <w:lang w:val="en-MY" w:eastAsia="zh-CN"/>
         </w:rPr>
-        <w:t>after reshaping wide-to-long data format</w:t>
-      </w:r>
-      <w:r>
-        <w:rPr>
-          <w:lang w:val="en-MY" w:eastAsia="zh-CN"/>
-        </w:rPr>
-        <w:t>. Feature construction is frequency-aware: annual data uses shorter lag/rolling windows and omits month-of-year encoding entirely, since a 12-year annual series cannot support a 12-period lag without producing an all-missing column, and a single annual observation has no within-year seasonality to encode.</w:t>
-      </w:r>
-    </w:p>
-    <w:p>
-      <w:pPr>
-        <w:rPr>
-          <w:lang w:val="en-MY" w:eastAsia="zh-CN"/>
-        </w:rPr>
-      </w:pPr>
-    </w:p>
-    <w:p>
-      <w:pPr>
-        <w:rPr>
-          <w:lang w:val="en-MY" w:eastAsia="zh-CN"/>
-        </w:rPr>
-      </w:pPr>
-      <w:r>
-        <w:rPr>
-          <w:lang w:val="en-MY" w:eastAsia="zh-CN"/>
-        </w:rPr>
-        <w:t xml:space="preserve">A specific defect was identified and corrected in this layer during testing: two derived columns (period-over-period difference, and a year-over-year ratio) were initially included as model inputs despite being computed from the current period's own count value. Because these columns are mathematically a function of the value being forecast, including them constitutes target leakage — the model could appear artificially accurate during </w:t>
-      </w:r>
-      <w:proofErr w:type="spellStart"/>
-      <w:r>
-        <w:rPr>
-          <w:lang w:val="en-MY" w:eastAsia="zh-CN"/>
-        </w:rPr>
-        <w:t>backtesting</w:t>
-      </w:r>
-      <w:proofErr w:type="spellEnd"/>
-      <w:r>
-        <w:rPr>
-          <w:lang w:val="en-MY" w:eastAsia="zh-CN"/>
-        </w:rPr>
-        <w:t xml:space="preserve"> while being unable to compute the same feature for a genuinely unknown future period. This was caught because it caused the recursive forecasting loop (described below) to fail with propagated missing values, and was corrected by excluding all such derived columns from the trainable feature set.</w:t>
+        <w:t xml:space="preserve">to be </w:t>
+      </w:r>
+      <w:r>
+        <w:rPr>
+          <w:lang w:val="en-MY" w:eastAsia="zh-CN"/>
+        </w:rPr>
+        <w:t>incorporated in future work.</w:t>
       </w:r>
     </w:p>
     <w:p>
@@ -5055,415 +5600,8 @@
         <w:rPr>
           <w:lang w:val="en-MY" w:eastAsia="zh-CN"/>
         </w:rPr>
-        <w:t>Forecasting Models</w:t>
-      </w:r>
-    </w:p>
-    <w:p>
-      <w:pPr>
-        <w:pStyle w:val="Heading4"/>
-        <w:rPr>
-          <w:lang w:val="en-MY" w:eastAsia="zh-CN"/>
-        </w:rPr>
-      </w:pPr>
-      <w:r>
-        <w:rPr>
-          <w:lang w:val="en-MY" w:eastAsia="zh-CN"/>
-        </w:rPr>
-        <w:t>Scikit-learn regressor with recursive forecasting</w:t>
-      </w:r>
-    </w:p>
-    <w:p>
-      <w:pPr>
-        <w:rPr>
-          <w:lang w:val="en-MY" w:eastAsia="zh-CN"/>
-        </w:rPr>
-      </w:pPr>
-      <w:r>
-        <w:rPr>
-          <w:lang w:val="en-MY" w:eastAsia="zh-CN"/>
-        </w:rPr>
-        <w:t xml:space="preserve">A </w:t>
-      </w:r>
-      <w:proofErr w:type="spellStart"/>
-      <w:r>
-        <w:rPr>
-          <w:lang w:val="en-MY" w:eastAsia="zh-CN"/>
-        </w:rPr>
-        <w:t>GradientBoostingRegressor</w:t>
-      </w:r>
-      <w:proofErr w:type="spellEnd"/>
-      <w:r>
-        <w:rPr>
-          <w:lang w:val="en-MY" w:eastAsia="zh-CN"/>
-        </w:rPr>
-        <w:t xml:space="preserve"> (or any user-supplied scikit-learn-compatible regressor) is trained on the engineered feature set. Because features such as lag_1 depend on the immediately preceding period's actual count, multi-step-ahead forecasting is performed recursively: the model predicts one step ahead, that prediction is appended to the working </w:t>
-      </w:r>
-      <w:r>
-        <w:rPr>
-          <w:lang w:val="en-MY" w:eastAsia="zh-CN"/>
-        </w:rPr>
-        <w:lastRenderedPageBreak/>
-        <w:t>history, features are recomputed including the new (predicted) value, and the next step is predicted from that — repeated for the requested forecast horizon.</w:t>
-      </w:r>
-    </w:p>
-    <w:p>
-      <w:pPr>
-        <w:pStyle w:val="Heading4"/>
-        <w:rPr>
-          <w:lang w:val="en-MY" w:eastAsia="zh-CN"/>
-        </w:rPr>
-      </w:pPr>
-      <w:r>
-        <w:rPr>
-          <w:lang w:val="en-MY" w:eastAsia="zh-CN"/>
-        </w:rPr>
-        <w:t>Prophet</w:t>
-      </w:r>
-    </w:p>
-    <w:p>
-      <w:pPr>
-        <w:rPr>
-          <w:lang w:val="en-MY" w:eastAsia="zh-CN"/>
-        </w:rPr>
-      </w:pPr>
-      <w:r>
-        <w:rPr>
-          <w:lang w:val="en-MY" w:eastAsia="zh-CN"/>
-        </w:rPr>
-        <w:t>Prophet is fitted directly on the (date, count) series without the engineered lag features, since it constructs its own trend and seasonality decomposition internally. A small grid search over Prophet's own hyperparameters (changepoint flexibility, seasonality strength, and additive vs multiplicative seasonality) is scored using the same walk-forward cross-validation standard used elsewhere.</w:t>
-      </w:r>
-    </w:p>
-    <w:p>
-      <w:pPr>
-        <w:pStyle w:val="Heading4"/>
-        <w:rPr>
-          <w:lang w:val="en-MY" w:eastAsia="zh-CN"/>
-        </w:rPr>
-      </w:pPr>
-      <w:proofErr w:type="spellStart"/>
-      <w:r>
-        <w:rPr>
-          <w:lang w:val="en-MY" w:eastAsia="zh-CN"/>
-        </w:rPr>
-        <w:t>S</w:t>
-      </w:r>
-      <w:r>
-        <w:rPr>
-          <w:lang w:val="en-MY" w:eastAsia="zh-CN"/>
-        </w:rPr>
-        <w:t>tatsmodels</w:t>
-      </w:r>
-      <w:proofErr w:type="spellEnd"/>
-      <w:r>
-        <w:rPr>
-          <w:lang w:val="en-MY" w:eastAsia="zh-CN"/>
-        </w:rPr>
-        <w:t xml:space="preserve"> — Exponential Smoothing and SARIMA</w:t>
-      </w:r>
-    </w:p>
-    <w:p>
-      <w:pPr>
-        <w:rPr>
-          <w:lang w:val="en-MY" w:eastAsia="zh-CN"/>
-        </w:rPr>
-      </w:pPr>
-      <w:r>
-        <w:rPr>
-          <w:lang w:val="en-MY" w:eastAsia="zh-CN"/>
-        </w:rPr>
-        <w:t>Both an additive Exponential Smoothing (ETS) model and a seasonal ARIMA (SARIMA) model are supported, selected by a method flag. As with Prophet, a small grid search over each method's own parameters (trend/damping/seasonal form for ETS; ARIMA order and seasonal order for SARIMA) is scored via walk-forward cross-validation.</w:t>
-      </w:r>
-    </w:p>
-    <w:p>
-      <w:pPr>
-        <w:pStyle w:val="Heading4"/>
-        <w:rPr>
-          <w:lang w:val="en-MY" w:eastAsia="zh-CN"/>
-        </w:rPr>
-      </w:pPr>
-      <w:r>
-        <w:rPr>
-          <w:lang w:val="en-MY" w:eastAsia="zh-CN"/>
-        </w:rPr>
-        <w:t>Common evaluation standard</w:t>
-      </w:r>
-    </w:p>
-    <w:p>
-      <w:pPr>
-        <w:rPr>
-          <w:lang w:val="en-MY" w:eastAsia="zh-CN"/>
-        </w:rPr>
-      </w:pPr>
-      <w:r>
-        <w:rPr>
-          <w:lang w:val="en-MY" w:eastAsia="zh-CN"/>
-        </w:rPr>
-        <w:t xml:space="preserve">All three approaches share the same evaluation contract: an optional log1p target transform (to stabilise variance), an expanding-window walk-forward cross-validation with a configurable number of folds, and a single final holdout split. A model-selection utility allows the user to choose from Linear Regression, SVR, k-Nearest Neighbours, Random Forest, Gradient Boosting, Prophet, and both </w:t>
-      </w:r>
-      <w:proofErr w:type="spellStart"/>
-      <w:r>
-        <w:rPr>
-          <w:lang w:val="en-MY" w:eastAsia="zh-CN"/>
-        </w:rPr>
-        <w:t>statsmodels</w:t>
-      </w:r>
-      <w:proofErr w:type="spellEnd"/>
-      <w:r>
-        <w:rPr>
-          <w:lang w:val="en-MY" w:eastAsia="zh-CN"/>
-        </w:rPr>
-        <w:t xml:space="preserve"> variants through one common interface.</w:t>
-      </w:r>
-    </w:p>
-    <w:p>
-      <w:pPr>
-        <w:pStyle w:val="Heading3"/>
-        <w:rPr>
-          <w:lang w:val="en-MY" w:eastAsia="zh-CN"/>
-        </w:rPr>
-      </w:pPr>
-      <w:r>
-        <w:rPr>
-          <w:lang w:val="en-MY" w:eastAsia="zh-CN"/>
-        </w:rPr>
-        <w:t>Population Normalisation</w:t>
-      </w:r>
-    </w:p>
-    <w:p>
-      <w:pPr>
-        <w:rPr>
-          <w:lang w:val="en-MY" w:eastAsia="zh-CN"/>
-        </w:rPr>
-      </w:pPr>
-      <w:r>
-        <w:rPr>
-          <w:lang w:val="en-MY" w:eastAsia="zh-CN"/>
-        </w:rPr>
-        <w:t xml:space="preserve">The </w:t>
-      </w:r>
-      <w:r>
-        <w:rPr>
-          <w:lang w:val="en-MY" w:eastAsia="zh-CN"/>
-        </w:rPr>
-        <w:t xml:space="preserve">boundary_loader.py performs a spatial join between Stats NZ 2023 </w:t>
-      </w:r>
-      <w:proofErr w:type="spellStart"/>
-      <w:r>
-        <w:rPr>
-          <w:lang w:val="en-MY" w:eastAsia="zh-CN"/>
-        </w:rPr>
-        <w:t>meshblock</w:t>
-      </w:r>
-      <w:proofErr w:type="spellEnd"/>
-      <w:r>
-        <w:rPr>
-          <w:lang w:val="en-MY" w:eastAsia="zh-CN"/>
-        </w:rPr>
-        <w:t xml:space="preserve"> population data and Police District boundary polygons, since the two geographies do not share a common attribute key. </w:t>
-      </w:r>
-      <w:r>
-        <w:rPr>
-          <w:lang w:val="en-MY" w:eastAsia="zh-CN"/>
-        </w:rPr>
-        <w:t>The are joined through</w:t>
-      </w:r>
-      <w:r>
-        <w:rPr>
-          <w:lang w:val="en-MY" w:eastAsia="zh-CN"/>
-        </w:rPr>
-        <w:t xml:space="preserve"> a centroid/within join (each </w:t>
-      </w:r>
-      <w:proofErr w:type="spellStart"/>
-      <w:r>
-        <w:rPr>
-          <w:lang w:val="en-MY" w:eastAsia="zh-CN"/>
-        </w:rPr>
-        <w:t>meshblock</w:t>
-      </w:r>
-      <w:proofErr w:type="spellEnd"/>
-      <w:r>
-        <w:rPr>
-          <w:lang w:val="en-MY" w:eastAsia="zh-CN"/>
-        </w:rPr>
-        <w:t xml:space="preserve"> is attributed to exactly one district). The implementation flags, rather than silently ignores, the number of </w:t>
-      </w:r>
-      <w:proofErr w:type="spellStart"/>
-      <w:r>
-        <w:rPr>
-          <w:lang w:val="en-MY" w:eastAsia="zh-CN"/>
-        </w:rPr>
-        <w:t>meshblocks</w:t>
-      </w:r>
-      <w:proofErr w:type="spellEnd"/>
-      <w:r>
-        <w:rPr>
-          <w:lang w:val="en-MY" w:eastAsia="zh-CN"/>
-        </w:rPr>
-        <w:t xml:space="preserve"> matched to more than one district under the intersects predicate, so that the practical extent of any double-counting can be assessed rather than assumed.</w:t>
-      </w:r>
-    </w:p>
-    <w:p>
-      <w:pPr>
-        <w:rPr>
-          <w:lang w:val="en-MY" w:eastAsia="zh-CN"/>
-        </w:rPr>
-      </w:pPr>
-    </w:p>
-    <w:p>
-      <w:pPr>
-        <w:rPr>
-          <w:lang w:val="en-MY" w:eastAsia="zh-CN"/>
-        </w:rPr>
-      </w:pPr>
-      <w:r>
-        <w:rPr>
-          <w:lang w:val="en-MY" w:eastAsia="zh-CN"/>
-        </w:rPr>
-        <w:t xml:space="preserve">District names required normalisation for </w:t>
-      </w:r>
-      <w:r>
-        <w:rPr>
-          <w:lang w:val="en-MY" w:eastAsia="zh-CN"/>
-        </w:rPr>
-        <w:t xml:space="preserve">a major </w:t>
-      </w:r>
-      <w:proofErr w:type="spellStart"/>
-      <w:r>
-        <w:rPr>
-          <w:lang w:val="en-MY" w:eastAsia="zh-CN"/>
-        </w:rPr>
-        <w:t>reson</w:t>
-      </w:r>
-      <w:proofErr w:type="spellEnd"/>
-      <w:r>
-        <w:rPr>
-          <w:lang w:val="en-MY" w:eastAsia="zh-CN"/>
-        </w:rPr>
-        <w:t xml:space="preserve">: inconsistent capitalisation (e.g. "Bay </w:t>
-      </w:r>
-      <w:proofErr w:type="gramStart"/>
-      <w:r>
-        <w:rPr>
-          <w:lang w:val="en-MY" w:eastAsia="zh-CN"/>
-        </w:rPr>
-        <w:t>Of</w:t>
-      </w:r>
-      <w:proofErr w:type="gramEnd"/>
-      <w:r>
-        <w:rPr>
-          <w:lang w:val="en-MY" w:eastAsia="zh-CN"/>
-        </w:rPr>
-        <w:t xml:space="preserve"> Plenty" vs "Bay of Plenty"</w:t>
-      </w:r>
-      <w:r>
-        <w:rPr>
-          <w:lang w:val="en-MY" w:eastAsia="zh-CN"/>
-        </w:rPr>
-        <w:t xml:space="preserve">, however, we could not remove the possibilities of having macron differences in district naming </w:t>
-      </w:r>
-      <w:r>
-        <w:rPr>
-          <w:lang w:val="en-MY" w:eastAsia="zh-CN"/>
-        </w:rPr>
-        <w:t>(e.g. "</w:t>
-      </w:r>
-      <w:proofErr w:type="spellStart"/>
-      <w:r>
-        <w:rPr>
-          <w:lang w:val="en-MY" w:eastAsia="zh-CN"/>
-        </w:rPr>
-        <w:t>Waitematā</w:t>
-      </w:r>
-      <w:proofErr w:type="spellEnd"/>
-      <w:r>
-        <w:rPr>
-          <w:lang w:val="en-MY" w:eastAsia="zh-CN"/>
-        </w:rPr>
-        <w:t xml:space="preserve">" vs "Waitemata") — the </w:t>
-      </w:r>
-      <w:r>
-        <w:rPr>
-          <w:lang w:val="en-MY" w:eastAsia="zh-CN"/>
-        </w:rPr>
-        <w:t>former</w:t>
-      </w:r>
-      <w:r>
-        <w:rPr>
-          <w:lang w:val="en-MY" w:eastAsia="zh-CN"/>
-        </w:rPr>
-        <w:t xml:space="preserve"> from the shapefile attribute table, the </w:t>
-      </w:r>
-      <w:r>
-        <w:rPr>
-          <w:lang w:val="en-MY" w:eastAsia="zh-CN"/>
-        </w:rPr>
-        <w:t>latter</w:t>
-      </w:r>
-      <w:r>
-        <w:rPr>
-          <w:lang w:val="en-MY" w:eastAsia="zh-CN"/>
-        </w:rPr>
-        <w:t xml:space="preserve"> from a crime export). Both are resolved by matching on a case-folded, diacritic-stripped key rather than an exact string match, which also protects against future districts exhibiting the same class of mismatch. Non-geographic labels — "Not Specified" (dropped, since there is no real geography to attribute population to) and "Total" (assigned a population equal to the sum of every real district, so its derived rate remains meaningful) — are resolved explicitly rather than left as unmatched rows.</w:t>
-      </w:r>
-    </w:p>
-    <w:p>
-      <w:pPr>
-        <w:rPr>
-          <w:lang w:val="en-MY" w:eastAsia="zh-CN"/>
-        </w:rPr>
-      </w:pPr>
-    </w:p>
-    <w:p>
-      <w:pPr>
-        <w:rPr>
-          <w:lang w:val="en-MY" w:eastAsia="zh-CN"/>
-        </w:rPr>
-      </w:pPr>
-      <w:r>
-        <w:rPr>
-          <w:lang w:val="en-MY" w:eastAsia="zh-CN"/>
-        </w:rPr>
-        <w:t xml:space="preserve">A methodological point worth recording explicitly: the available population data is a single 2023 snapshot rather than a year-by-year time series. Dividing every year's crime count by the same constant population figure rescales the series without changing its shape — meaning </w:t>
-      </w:r>
-      <w:r>
-        <w:rPr>
-          <w:lang w:val="en-MY" w:eastAsia="zh-CN"/>
-        </w:rPr>
-        <w:lastRenderedPageBreak/>
-        <w:t xml:space="preserve">that, given the currently available data, forecasting the per-capita rate directly and forecasting the raw count and converting afterward are mathematically equivalent. The system therefore forecasts raw counts and derives rates as a reporting-layer conversion, and notes that this would change if genuinely time-varying population estimates (which Stats NZ does publish for non-census years, at Territorial Authority level) </w:t>
-      </w:r>
-      <w:r>
-        <w:rPr>
-          <w:lang w:val="en-MY" w:eastAsia="zh-CN"/>
-        </w:rPr>
-        <w:t>are</w:t>
-      </w:r>
-      <w:r>
-        <w:rPr>
-          <w:lang w:val="en-MY" w:eastAsia="zh-CN"/>
-        </w:rPr>
-        <w:t xml:space="preserve"> </w:t>
-      </w:r>
-      <w:r>
-        <w:rPr>
-          <w:lang w:val="en-MY" w:eastAsia="zh-CN"/>
-        </w:rPr>
-        <w:t xml:space="preserve">to be </w:t>
-      </w:r>
-      <w:r>
-        <w:rPr>
-          <w:lang w:val="en-MY" w:eastAsia="zh-CN"/>
-        </w:rPr>
-        <w:t>incorporated in future work.</w:t>
-      </w:r>
-    </w:p>
-    <w:p>
-      <w:pPr>
-        <w:pStyle w:val="Heading3"/>
-        <w:rPr>
-          <w:lang w:val="en-MY" w:eastAsia="zh-CN"/>
-        </w:rPr>
-      </w:pPr>
+        <w:t xml:space="preserve">5.1.5 </w:t>
+      </w:r>
       <w:r>
         <w:rPr>
           <w:lang w:val="en-MY" w:eastAsia="zh-CN"/>
@@ -5584,6 +5722,9 @@
         <w:pStyle w:val="Heading2"/>
       </w:pPr>
       <w:r>
+        <w:t xml:space="preserve">5.2 </w:t>
+      </w:r>
+      <w:r>
         <w:t>Third Party Integration and Dependencies</w:t>
       </w:r>
     </w:p>
@@ -5608,19 +5749,7 @@
         <w:rPr>
           <w:lang w:val="en-MY" w:eastAsia="zh-CN"/>
         </w:rPr>
-        <w:t xml:space="preserve">andas </w:t>
-      </w:r>
-      <w:r>
-        <w:rPr>
-          <w:lang w:val="en-MY" w:eastAsia="zh-CN"/>
-        </w:rPr>
-        <w:t>and</w:t>
-      </w:r>
-      <w:r>
-        <w:rPr>
-          <w:lang w:val="en-MY" w:eastAsia="zh-CN"/>
-        </w:rPr>
-        <w:t xml:space="preserve"> </w:t>
+        <w:t xml:space="preserve">andas and </w:t>
       </w:r>
       <w:r>
         <w:rPr>
@@ -5837,6 +5966,9 @@
         <w:pStyle w:val="Heading2"/>
       </w:pPr>
       <w:r>
+        <w:t xml:space="preserve">5.3 </w:t>
+      </w:r>
+      <w:r>
         <w:t>Technical Challenges and Engineering Solutions</w:t>
       </w:r>
     </w:p>
@@ -5872,6 +6004,12 @@
           <w:lang w:val="en-MY" w:eastAsia="zh-CN"/>
         </w:rPr>
       </w:pPr>
+      <w:r>
+        <w:rPr>
+          <w:lang w:val="en-MY" w:eastAsia="zh-CN"/>
+        </w:rPr>
+        <w:t xml:space="preserve">5.3.1 </w:t>
+      </w:r>
       <w:r>
         <w:rPr>
           <w:lang w:val="en-MY" w:eastAsia="zh-CN"/>
@@ -5968,7 +6106,14 @@
         <w:rPr>
           <w:lang w:val="en-MY" w:eastAsia="zh-CN"/>
         </w:rPr>
-        <w:t xml:space="preserve"> errors, recursive multi-step forecasting failed at runtime due to propagated </w:t>
+        <w:t xml:space="preserve"> errors, recursive multi-step forecasting failed at </w:t>
+      </w:r>
+      <w:r>
+        <w:rPr>
+          <w:lang w:val="en-MY" w:eastAsia="zh-CN"/>
+        </w:rPr>
+        <w:lastRenderedPageBreak/>
+        <w:t xml:space="preserve">runtime due to propagated </w:t>
       </w:r>
       <w:proofErr w:type="spellStart"/>
       <w:r>
@@ -6017,13 +6162,6 @@
     </w:p>
     <w:p>
       <w:pPr>
-        <w:rPr>
-          <w:lang w:val="en-MY" w:eastAsia="zh-CN"/>
-        </w:rPr>
-      </w:pPr>
-    </w:p>
-    <w:p>
-      <w:pPr>
         <w:pStyle w:val="Heading3"/>
         <w:rPr>
           <w:lang w:val="en-MY" w:eastAsia="zh-CN"/>
@@ -6033,7 +6171,12 @@
         <w:rPr>
           <w:lang w:val="en-MY" w:eastAsia="zh-CN"/>
         </w:rPr>
-        <w:lastRenderedPageBreak/>
+        <w:t xml:space="preserve">5.3.2 </w:t>
+      </w:r>
+      <w:r>
+        <w:rPr>
+          <w:lang w:val="en-MY" w:eastAsia="zh-CN"/>
+        </w:rPr>
         <w:t xml:space="preserve">Spatial Normalization </w:t>
       </w:r>
       <w:r>
@@ -6064,21 +6207,7 @@
         <w:rPr>
           <w:lang w:val="en-MY" w:eastAsia="zh-CN"/>
         </w:rPr>
-        <w:t xml:space="preserve">The Challenge: Joining crime export data with geospatial boundary shapefiles resulted in severe record drops due to naming inconsistencies across government sources. Differences included varying capitalization ("Bay </w:t>
-      </w:r>
-      <w:proofErr w:type="gramStart"/>
-      <w:r>
-        <w:rPr>
-          <w:lang w:val="en-MY" w:eastAsia="zh-CN"/>
-        </w:rPr>
-        <w:t>Of</w:t>
-      </w:r>
-      <w:proofErr w:type="gramEnd"/>
-      <w:r>
-        <w:rPr>
-          <w:lang w:val="en-MY" w:eastAsia="zh-CN"/>
-        </w:rPr>
-        <w:t xml:space="preserve"> Plenty" vs. "Bay of Plenty") and diacritic/macron variations ("</w:t>
+        <w:t>The Challenge: Joining crime export data with geospatial boundary shapefiles resulted in severe record drops due to naming inconsistencies across government sources. Differences included varying capitalization ("Bay Of Plenty" vs. "Bay of Plenty") and diacritic/macron variations ("</w:t>
       </w:r>
       <w:proofErr w:type="spellStart"/>
       <w:r>
@@ -6124,6 +6253,12 @@
         <w:rPr>
           <w:lang w:val="en-MY" w:eastAsia="zh-CN"/>
         </w:rPr>
+        <w:t xml:space="preserve">5.3.3 </w:t>
+      </w:r>
+      <w:r>
+        <w:rPr>
+          <w:lang w:val="en-MY" w:eastAsia="zh-CN"/>
+        </w:rPr>
         <w:t>Mathematical Equivalence of Per-Capita Rate Forecasting</w:t>
       </w:r>
     </w:p>
@@ -6194,6 +6329,12 @@
           <w:lang w:val="en-MY" w:eastAsia="zh-CN"/>
         </w:rPr>
       </w:pPr>
+      <w:r>
+        <w:rPr>
+          <w:lang w:val="en-MY" w:eastAsia="zh-CN"/>
+        </w:rPr>
+        <w:t xml:space="preserve">5.3.4 </w:t>
+      </w:r>
       <w:r>
         <w:rPr>
           <w:lang w:val="en-MY" w:eastAsia="zh-CN"/>
@@ -6363,7 +6504,245 @@
         <w:jc w:val="both"/>
       </w:pPr>
       <w:r>
+        <w:lastRenderedPageBreak/>
+        <w:t xml:space="preserve">6.0 </w:t>
+      </w:r>
+      <w:r>
         <w:t>Evaluation and Testing</w:t>
+      </w:r>
+    </w:p>
+    <w:p>
+      <w:pPr>
+        <w:pStyle w:val="Heading2"/>
+      </w:pPr>
+      <w:r>
+        <w:t xml:space="preserve">6.1 </w:t>
+      </w:r>
+      <w:r>
+        <w:t>Testing Methodology</w:t>
+      </w:r>
+    </w:p>
+    <w:p>
+      <w:pPr>
+        <w:rPr>
+          <w:lang w:val="en-MY" w:eastAsia="zh-CN"/>
+        </w:rPr>
+      </w:pPr>
+      <w:r>
+        <w:rPr>
+          <w:lang w:val="en-MY" w:eastAsia="zh-CN"/>
+        </w:rPr>
+        <w:t xml:space="preserve">Every module in this project was executed against real Police Data NZ exports or, where real data was insufficient, carefully constructed synthetic data, before being treated as complete. </w:t>
+      </w:r>
+      <w:r>
+        <w:rPr>
+          <w:lang w:val="en-MY" w:eastAsia="zh-CN"/>
+        </w:rPr>
+        <w:t>This</w:t>
+      </w:r>
+      <w:r>
+        <w:rPr>
+          <w:lang w:val="en-MY" w:eastAsia="zh-CN"/>
+        </w:rPr>
+        <w:t xml:space="preserve"> directly surfaced several defects that a purely static code review would very plausibly have missed, since each depended on the specific numeric or structural shape of the data rather than on obviously incorrect syntax.</w:t>
+      </w:r>
+    </w:p>
+    <w:p>
+      <w:pPr>
+        <w:rPr>
+          <w:lang w:val="en-MY" w:eastAsia="zh-CN"/>
+        </w:rPr>
+      </w:pPr>
+    </w:p>
+    <w:p>
+      <w:pPr>
+        <w:rPr>
+          <w:lang w:val="en-MY" w:eastAsia="zh-CN"/>
+        </w:rPr>
+      </w:pPr>
+      <w:r>
+        <w:rPr>
+          <w:lang w:val="en-MY" w:eastAsia="zh-CN"/>
+        </w:rPr>
+        <w:t xml:space="preserve">Two complementary </w:t>
+      </w:r>
+      <w:r>
+        <w:rPr>
+          <w:lang w:val="en-MY" w:eastAsia="zh-CN"/>
+        </w:rPr>
+        <w:t>back tests</w:t>
+      </w:r>
+      <w:r>
+        <w:rPr>
+          <w:lang w:val="en-MY" w:eastAsia="zh-CN"/>
+        </w:rPr>
+        <w:t xml:space="preserve"> are used throughout. A single holdout split withholds the most recent periods from training entirely, giving one clean out-of-sample comparison. An expanding-window walk-forward cross-validation additionally re-evaluates the same model configuration across several earlier time windows, giving a sense of how stable performance is across different points in history rather than trusting a single, possibly lucky or unlucky, holdout window.</w:t>
+      </w:r>
+    </w:p>
+    <w:p>
+      <w:pPr>
+        <w:rPr>
+          <w:lang w:val="en-MY" w:eastAsia="zh-CN"/>
+        </w:rPr>
+      </w:pPr>
+    </w:p>
+    <w:p>
+      <w:pPr>
+        <w:rPr>
+          <w:lang w:val="en-MY" w:eastAsia="zh-CN"/>
+        </w:rPr>
+      </w:pPr>
+      <w:r>
+        <w:rPr>
+          <w:lang w:val="en-MY" w:eastAsia="zh-CN"/>
+        </w:rPr>
+        <w:t xml:space="preserve">It should be stated plainly that this cross-validation is not fully unbiased: hyperparameter tuning is performed once, using all data prior to the final holdout, and several of the walk-forward folds' test windows fall inside that same span. This does not constitute data leakage in the strict sense — no model is ever evaluated on data it was directly fitted to — but it does mean the reported cross-validation error is mildly optimistic relative to a fully nested cross-validation. </w:t>
+      </w:r>
+    </w:p>
+    <w:p>
+      <w:pPr>
+        <w:rPr>
+          <w:lang w:val="en-MY" w:eastAsia="zh-CN"/>
+        </w:rPr>
+      </w:pPr>
+    </w:p>
+    <w:p>
+      <w:pPr>
+        <w:rPr>
+          <w:lang w:val="en-MY" w:eastAsia="zh-CN"/>
+        </w:rPr>
+      </w:pPr>
+      <w:r>
+        <w:rPr>
+          <w:lang w:val="en-MY" w:eastAsia="zh-CN"/>
+        </w:rPr>
+        <w:t xml:space="preserve">A fully nested approach (re-tuning inside every fold) would remove this bias but was judged not to be worth its substantially higher computational cost for a project at this scale; this is recorded as a candidate improvement in </w:t>
+      </w:r>
+      <w:r>
+        <w:rPr>
+          <w:lang w:val="en-MY" w:eastAsia="zh-CN"/>
+        </w:rPr>
+        <w:t>the future development</w:t>
+      </w:r>
+      <w:r>
+        <w:rPr>
+          <w:lang w:val="en-MY" w:eastAsia="zh-CN"/>
+        </w:rPr>
+        <w:t>.</w:t>
+      </w:r>
+    </w:p>
+    <w:p/>
+    <w:p>
+      <w:pPr>
+        <w:pStyle w:val="Heading2"/>
+      </w:pPr>
+      <w:r>
+        <w:t xml:space="preserve">6.2 </w:t>
+      </w:r>
+      <w:r>
+        <w:t>Performance Benchmarks and Model Metrics</w:t>
+      </w:r>
+    </w:p>
+    <w:p>
+      <w:pPr>
+        <w:spacing w:after="160"/>
+      </w:pPr>
+      <w:r>
+        <w:t xml:space="preserve">A scikit-learn Random Forest model, </w:t>
+      </w:r>
+      <w:r>
+        <w:t>back tested</w:t>
+      </w:r>
+      <w:r>
+        <w:t xml:space="preserve"> against Auckland City's real monthly crime series using a six-month holdout, achieved a mean absolute error of approximately </w:t>
+      </w:r>
+      <w:r>
+        <w:t>40</w:t>
+      </w:r>
+      <w:r>
+        <w:t xml:space="preserve"> offences, a root-mean-squared error of approximately </w:t>
+      </w:r>
+      <w:r>
+        <w:t>56</w:t>
+      </w:r>
+      <w:r>
+        <w:t xml:space="preserve">, and a mean absolute percentage error of approximately </w:t>
+      </w:r>
+      <w:r>
+        <w:t>0.05</w:t>
+      </w:r>
+      <w:r>
+        <w:t xml:space="preserve">. Prophet and </w:t>
+      </w:r>
+      <w:proofErr w:type="spellStart"/>
+      <w:r>
+        <w:t>statsmodels</w:t>
+      </w:r>
+      <w:proofErr w:type="spellEnd"/>
+      <w:r>
+        <w:t>' Exponential Smoothing, evaluated on the same district and holdout window, produced forecasts in the same broad range (within a few percent of one another), which was treated as a useful sanity check that no single model was producing an outlier result.</w:t>
+      </w:r>
+    </w:p>
+    <w:p>
+      <w:pPr>
+        <w:spacing w:after="160"/>
+      </w:pPr>
+      <w:r>
+        <w:t xml:space="preserve">The </w:t>
+      </w:r>
+      <w:r>
+        <w:t>annual</w:t>
+      </w:r>
+      <w:r>
+        <w:t xml:space="preserve"> engineered feature set</w:t>
+      </w:r>
+      <w:r>
+        <w:t>,</w:t>
+      </w:r>
+      <w:r>
+        <w:t xml:space="preserve"> which </w:t>
+      </w:r>
+      <w:r>
+        <w:t>does not include</w:t>
+      </w:r>
+      <w:r>
+        <w:t xml:space="preserve"> </w:t>
+      </w:r>
+      <w:r>
+        <w:t>the</w:t>
+      </w:r>
+      <w:r>
+        <w:t xml:space="preserve"> twelve periods of lag and rolling-window history</w:t>
+      </w:r>
+      <w:r>
+        <w:t>,</w:t>
+      </w:r>
+      <w:r>
+        <w:t xml:space="preserve"> could not be fully validated against the real </w:t>
+      </w:r>
+      <w:r>
+        <w:t>annual</w:t>
+      </w:r>
+      <w:r>
+        <w:t xml:space="preserve"> district data as currently</w:t>
+      </w:r>
+      <w:r>
+        <w:t xml:space="preserve">, the number of data does not support the entire </w:t>
+      </w:r>
+      <w:r>
+        <w:t xml:space="preserve">walk-forward cross-validation </w:t>
+      </w:r>
+      <w:r>
+        <w:t xml:space="preserve">feature for </w:t>
+      </w:r>
+      <w:r>
+        <w:t>future forecasting.</w:t>
+      </w:r>
+      <w:r>
+        <w:t xml:space="preserve"> This is recorded honestly as a data-volume limitation rather than worked around by silently loosening the validation criteria</w:t>
+      </w:r>
+      <w:r>
+        <w:t>.</w:t>
       </w:r>
     </w:p>
     <w:p>
@@ -6374,72 +6753,10 @@
           <w:kern w:val="2"/>
           <w:sz w:val="28"/>
           <w:szCs w:val="26"/>
-          <w:lang w:val="en-MY" w:eastAsia="zh-CN"/>
+          <w:lang w:eastAsia="zh-CN"/>
           <w14:ligatures w14:val="standardContextual"/>
         </w:rPr>
       </w:pPr>
-      <w:r>
-        <w:rPr>
-          <w:rFonts w:eastAsiaTheme="majorEastAsia" w:cstheme="majorBidi"/>
-          <w:color w:val="2F5496" w:themeColor="accent1" w:themeShade="BF"/>
-          <w:kern w:val="2"/>
-          <w:sz w:val="28"/>
-          <w:szCs w:val="26"/>
-          <w:lang w:val="en-MY" w:eastAsia="zh-CN"/>
-          <w14:ligatures w14:val="standardContextual"/>
-        </w:rPr>
-        <w:t>Testing Methodology</w:t>
-      </w:r>
-    </w:p>
-    <w:p>
-      <w:pPr>
-        <w:rPr>
-          <w:rFonts w:eastAsiaTheme="majorEastAsia" w:cstheme="majorBidi"/>
-          <w:color w:val="2F5496" w:themeColor="accent1" w:themeShade="BF"/>
-          <w:kern w:val="2"/>
-          <w:sz w:val="28"/>
-          <w:szCs w:val="26"/>
-          <w:lang w:val="en-MY" w:eastAsia="zh-CN"/>
-          <w14:ligatures w14:val="standardContextual"/>
-        </w:rPr>
-      </w:pPr>
-      <w:r>
-        <w:rPr>
-          <w:rFonts w:eastAsiaTheme="majorEastAsia" w:cstheme="majorBidi"/>
-          <w:color w:val="2F5496" w:themeColor="accent1" w:themeShade="BF"/>
-          <w:kern w:val="2"/>
-          <w:sz w:val="28"/>
-          <w:szCs w:val="26"/>
-          <w:lang w:val="en-MY" w:eastAsia="zh-CN"/>
-          <w14:ligatures w14:val="standardContextual"/>
-        </w:rPr>
-        <w:t>Performance Benchmarks and Model Metrics</w:t>
-      </w:r>
-    </w:p>
-    <w:p>
-      <w:pPr>
-        <w:rPr>
-          <w:rFonts w:eastAsiaTheme="majorEastAsia" w:cstheme="majorBidi"/>
-          <w:color w:val="2F5496" w:themeColor="accent1" w:themeShade="BF"/>
-          <w:kern w:val="2"/>
-          <w:sz w:val="28"/>
-          <w:szCs w:val="26"/>
-          <w:lang w:val="en-MY" w:eastAsia="zh-CN"/>
-          <w14:ligatures w14:val="standardContextual"/>
-        </w:rPr>
-      </w:pPr>
-      <w:r>
-        <w:rPr>
-          <w:rFonts w:eastAsiaTheme="majorEastAsia" w:cstheme="majorBidi"/>
-          <w:color w:val="2F5496" w:themeColor="accent1" w:themeShade="BF"/>
-          <w:kern w:val="2"/>
-          <w:sz w:val="28"/>
-          <w:szCs w:val="26"/>
-          <w:lang w:val="en-MY" w:eastAsia="zh-CN"/>
-          <w14:ligatures w14:val="standardContextual"/>
-        </w:rPr>
-        <w:t>User Acceptance and Quality Assurance Results</w:t>
-      </w:r>
     </w:p>
     <w:p>
       <w:pPr>
@@ -6534,7 +6851,429 @@
         <w:jc w:val="both"/>
       </w:pPr>
       <w:r>
+        <w:t xml:space="preserve">8.0 </w:t>
+      </w:r>
+      <w:r>
         <w:t>Project Management and Reflection</w:t>
+      </w:r>
+    </w:p>
+    <w:p>
+      <w:pPr>
+        <w:spacing w:after="160"/>
+        <w:rPr>
+          <w:lang w:val="en-MY" w:eastAsia="zh-CN"/>
+        </w:rPr>
+      </w:pPr>
+      <w:r>
+        <w:rPr>
+          <w:lang w:val="en-MY" w:eastAsia="zh-CN"/>
+        </w:rPr>
+        <w:t>The project was developed iteratively rather than to a fixed upfront specification</w:t>
+      </w:r>
+      <w:r>
+        <w:rPr>
+          <w:lang w:val="en-MY" w:eastAsia="zh-CN"/>
+        </w:rPr>
+        <w:t>. T</w:t>
+      </w:r>
+      <w:r>
+        <w:rPr>
+          <w:lang w:val="en-MY" w:eastAsia="zh-CN"/>
+        </w:rPr>
+        <w:t>he initial proposal defined the overall aim and scope, after which each subsequent module was built in response to the actual shape of the data as it was obtained, rather than assumed in advance.</w:t>
+      </w:r>
+    </w:p>
+    <w:p>
+      <w:pPr>
+        <w:rPr>
+          <w:lang w:val="en-MY" w:eastAsia="zh-CN"/>
+        </w:rPr>
+      </w:pPr>
+    </w:p>
+    <w:p>
+      <w:pPr>
+        <w:pStyle w:val="Heading2"/>
+      </w:pPr>
+      <w:r>
+        <w:t>Timeline and Milestone Tracking</w:t>
+      </w:r>
+    </w:p>
+    <w:p>
+      <w:pPr>
+        <w:pStyle w:val="Heading2"/>
+      </w:pPr>
+      <w:r>
+        <w:t>Challenges Encountered</w:t>
+      </w:r>
+    </w:p>
+    <w:p>
+      <w:pPr>
+        <w:pStyle w:val="ListParagraph"/>
+        <w:numPr>
+          <w:ilvl w:val="0"/>
+          <w:numId w:val="14"/>
+        </w:numPr>
+        <w:rPr>
+          <w:lang w:val="en-MY" w:eastAsia="zh-CN"/>
+        </w:rPr>
+      </w:pPr>
+      <w:r>
+        <w:rPr>
+          <w:b/>
+          <w:bCs/>
+          <w:lang w:val="en-MY" w:eastAsia="zh-CN"/>
+        </w:rPr>
+        <w:t xml:space="preserve">Data </w:t>
+      </w:r>
+      <w:r>
+        <w:rPr>
+          <w:b/>
+          <w:bCs/>
+          <w:lang w:val="en-MY" w:eastAsia="zh-CN"/>
+        </w:rPr>
+        <w:t>H</w:t>
+      </w:r>
+      <w:r>
+        <w:rPr>
+          <w:b/>
+          <w:bCs/>
+          <w:lang w:val="en-MY" w:eastAsia="zh-CN"/>
+        </w:rPr>
+        <w:t>eterogeneity</w:t>
+      </w:r>
+      <w:r>
+        <w:rPr>
+          <w:lang w:val="en-MY" w:eastAsia="zh-CN"/>
+        </w:rPr>
+        <w:t xml:space="preserve">: </w:t>
+      </w:r>
+      <w:r>
+        <w:rPr>
+          <w:lang w:val="en-MY" w:eastAsia="zh-CN"/>
+        </w:rPr>
+        <w:t>S</w:t>
+      </w:r>
+      <w:r>
+        <w:rPr>
+          <w:lang w:val="en-MY" w:eastAsia="zh-CN"/>
+        </w:rPr>
+        <w:t>uccessive exports from the same public data source used materially different layout</w:t>
+      </w:r>
+      <w:r>
+        <w:rPr>
+          <w:lang w:val="en-MY" w:eastAsia="zh-CN"/>
+        </w:rPr>
+        <w:t xml:space="preserve"> and</w:t>
+      </w:r>
+      <w:r>
+        <w:rPr>
+          <w:lang w:val="en-MY" w:eastAsia="zh-CN"/>
+        </w:rPr>
+        <w:t xml:space="preserve"> month-abbreviation conventions, requiring the ingestion layer to detect structure rather than assume it.</w:t>
+      </w:r>
+    </w:p>
+    <w:p>
+      <w:pPr>
+        <w:pStyle w:val="ListParagraph"/>
+        <w:numPr>
+          <w:ilvl w:val="0"/>
+          <w:numId w:val="14"/>
+        </w:numPr>
+        <w:rPr>
+          <w:lang w:val="en-MY" w:eastAsia="zh-CN"/>
+        </w:rPr>
+      </w:pPr>
+      <w:r>
+        <w:rPr>
+          <w:b/>
+          <w:bCs/>
+          <w:lang w:val="en-MY" w:eastAsia="zh-CN"/>
+        </w:rPr>
+        <w:t>Insufficient</w:t>
+      </w:r>
+      <w:r>
+        <w:rPr>
+          <w:b/>
+          <w:bCs/>
+          <w:lang w:val="en-MY" w:eastAsia="zh-CN"/>
+        </w:rPr>
+        <w:t xml:space="preserve"> </w:t>
+      </w:r>
+      <w:r>
+        <w:rPr>
+          <w:b/>
+          <w:bCs/>
+          <w:lang w:val="en-MY" w:eastAsia="zh-CN"/>
+        </w:rPr>
+        <w:t>T</w:t>
+      </w:r>
+      <w:r>
+        <w:rPr>
+          <w:b/>
+          <w:bCs/>
+          <w:lang w:val="en-MY" w:eastAsia="zh-CN"/>
+        </w:rPr>
+        <w:t xml:space="preserve">ime </w:t>
+      </w:r>
+      <w:r>
+        <w:rPr>
+          <w:b/>
+          <w:bCs/>
+          <w:lang w:val="en-MY" w:eastAsia="zh-CN"/>
+        </w:rPr>
+        <w:t>S</w:t>
+      </w:r>
+      <w:r>
+        <w:rPr>
+          <w:b/>
+          <w:bCs/>
+          <w:lang w:val="en-MY" w:eastAsia="zh-CN"/>
+        </w:rPr>
+        <w:t>eries</w:t>
+      </w:r>
+      <w:r>
+        <w:rPr>
+          <w:lang w:val="en-MY" w:eastAsia="zh-CN"/>
+        </w:rPr>
+        <w:t xml:space="preserve">: </w:t>
+      </w:r>
+      <w:r>
+        <w:rPr>
+          <w:lang w:val="en-MY" w:eastAsia="zh-CN"/>
+        </w:rPr>
+        <w:t>T</w:t>
+      </w:r>
+      <w:r>
+        <w:rPr>
+          <w:lang w:val="en-MY" w:eastAsia="zh-CN"/>
+        </w:rPr>
+        <w:t xml:space="preserve">he practical length of real </w:t>
+      </w:r>
+      <w:r>
+        <w:rPr>
+          <w:lang w:val="en-MY" w:eastAsia="zh-CN"/>
+        </w:rPr>
+        <w:t>annual</w:t>
+      </w:r>
+      <w:r>
+        <w:rPr>
+          <w:lang w:val="en-MY" w:eastAsia="zh-CN"/>
+        </w:rPr>
+        <w:t xml:space="preserve"> </w:t>
+      </w:r>
+      <w:r>
+        <w:rPr>
+          <w:lang w:val="en-MY" w:eastAsia="zh-CN"/>
+        </w:rPr>
+        <w:t xml:space="preserve">level </w:t>
+      </w:r>
+      <w:r>
+        <w:rPr>
+          <w:lang w:val="en-MY" w:eastAsia="zh-CN"/>
+        </w:rPr>
+        <w:t xml:space="preserve">history constrains </w:t>
+      </w:r>
+      <w:r>
+        <w:rPr>
+          <w:lang w:val="en-MY" w:eastAsia="zh-CN"/>
+        </w:rPr>
+        <w:t xml:space="preserve">the </w:t>
+      </w:r>
+      <w:r>
+        <w:rPr>
+          <w:lang w:val="en-MY" w:eastAsia="zh-CN"/>
+        </w:rPr>
+        <w:t>amount</w:t>
+      </w:r>
+      <w:r>
+        <w:rPr>
+          <w:lang w:val="en-MY" w:eastAsia="zh-CN"/>
+        </w:rPr>
+        <w:t xml:space="preserve"> of data for walk-forward cross-validation </w:t>
+      </w:r>
+      <w:r>
+        <w:rPr>
+          <w:lang w:val="en-MY" w:eastAsia="zh-CN"/>
+        </w:rPr>
+        <w:t>during forecasting stage.</w:t>
+      </w:r>
+    </w:p>
+    <w:p>
+      <w:pPr>
+        <w:pStyle w:val="ListParagraph"/>
+        <w:numPr>
+          <w:ilvl w:val="0"/>
+          <w:numId w:val="14"/>
+        </w:numPr>
+        <w:rPr>
+          <w:lang w:val="en-MY" w:eastAsia="zh-CN"/>
+        </w:rPr>
+      </w:pPr>
+      <w:r>
+        <w:rPr>
+          <w:b/>
+          <w:bCs/>
+          <w:lang w:val="en-MY" w:eastAsia="zh-CN"/>
+        </w:rPr>
+        <w:t xml:space="preserve">Software </w:t>
+      </w:r>
+      <w:r>
+        <w:rPr>
+          <w:b/>
+          <w:bCs/>
+          <w:lang w:val="en-MY" w:eastAsia="zh-CN"/>
+        </w:rPr>
+        <w:t>E</w:t>
+      </w:r>
+      <w:r>
+        <w:rPr>
+          <w:b/>
+          <w:bCs/>
+          <w:lang w:val="en-MY" w:eastAsia="zh-CN"/>
+        </w:rPr>
+        <w:t xml:space="preserve">nvironment </w:t>
+      </w:r>
+      <w:r>
+        <w:rPr>
+          <w:b/>
+          <w:bCs/>
+          <w:lang w:val="en-MY" w:eastAsia="zh-CN"/>
+        </w:rPr>
+        <w:t>I</w:t>
+      </w:r>
+      <w:r>
+        <w:rPr>
+          <w:b/>
+          <w:bCs/>
+          <w:lang w:val="en-MY" w:eastAsia="zh-CN"/>
+        </w:rPr>
+        <w:t>nstability</w:t>
+      </w:r>
+      <w:r>
+        <w:rPr>
+          <w:lang w:val="en-MY" w:eastAsia="zh-CN"/>
+        </w:rPr>
+        <w:t xml:space="preserve">: </w:t>
+      </w:r>
+      <w:r>
+        <w:rPr>
+          <w:lang w:val="en-MY" w:eastAsia="zh-CN"/>
+        </w:rPr>
+        <w:t>D</w:t>
+      </w:r>
+      <w:r>
+        <w:rPr>
+          <w:lang w:val="en-MY" w:eastAsia="zh-CN"/>
+        </w:rPr>
+        <w:t xml:space="preserve">ependency version mismatches (notably a very </w:t>
+      </w:r>
+      <w:r>
+        <w:rPr>
+          <w:lang w:val="en-MY" w:eastAsia="zh-CN"/>
+        </w:rPr>
+        <w:t xml:space="preserve">major issue caused by </w:t>
+      </w:r>
+      <w:proofErr w:type="spellStart"/>
+      <w:r>
+        <w:rPr>
+          <w:lang w:val="en-MY" w:eastAsia="zh-CN"/>
+        </w:rPr>
+        <w:t>G</w:t>
+      </w:r>
+      <w:r>
+        <w:rPr>
+          <w:lang w:val="en-MY" w:eastAsia="zh-CN"/>
+        </w:rPr>
+        <w:t>eopandas</w:t>
+      </w:r>
+      <w:proofErr w:type="spellEnd"/>
+      <w:r>
+        <w:rPr>
+          <w:lang w:val="en-MY" w:eastAsia="zh-CN"/>
+        </w:rPr>
+        <w:t>’ other dependencies that crashes with NumPy and Pandas</w:t>
+      </w:r>
+      <w:r>
+        <w:rPr>
+          <w:lang w:val="en-MY" w:eastAsia="zh-CN"/>
+        </w:rPr>
+        <w:t xml:space="preserve"> installed version</w:t>
+      </w:r>
+      <w:r>
+        <w:rPr>
+          <w:lang w:val="en-MY" w:eastAsia="zh-CN"/>
+        </w:rPr>
+        <w:t>) caused import-time failures unrelated to the project's own logic, and required targeted diagnosis rather than blanket reinstallation.</w:t>
+      </w:r>
+    </w:p>
+    <w:p>
+      <w:pPr>
+        <w:pStyle w:val="ListParagraph"/>
+        <w:numPr>
+          <w:ilvl w:val="0"/>
+          <w:numId w:val="14"/>
+        </w:numPr>
+        <w:rPr>
+          <w:lang w:val="en-MY" w:eastAsia="zh-CN"/>
+        </w:rPr>
+      </w:pPr>
+      <w:r>
+        <w:rPr>
+          <w:b/>
+          <w:bCs/>
+          <w:lang w:val="en-MY" w:eastAsia="zh-CN"/>
+        </w:rPr>
+        <w:t>Issues Encountered</w:t>
+      </w:r>
+      <w:r>
+        <w:rPr>
+          <w:b/>
+          <w:bCs/>
+          <w:lang w:val="en-MY" w:eastAsia="zh-CN"/>
+        </w:rPr>
+        <w:t xml:space="preserve"> during Implementation</w:t>
+      </w:r>
+      <w:r>
+        <w:rPr>
+          <w:lang w:val="en-MY" w:eastAsia="zh-CN"/>
+        </w:rPr>
+        <w:t xml:space="preserve">: </w:t>
+      </w:r>
+      <w:r>
+        <w:rPr>
+          <w:lang w:val="en-MY" w:eastAsia="zh-CN"/>
+        </w:rPr>
+        <w:t>A</w:t>
+      </w:r>
+      <w:r>
+        <w:rPr>
+          <w:lang w:val="en-MY" w:eastAsia="zh-CN"/>
+        </w:rPr>
+        <w:t xml:space="preserve">s documented in Section </w:t>
+      </w:r>
+      <w:r>
+        <w:rPr>
+          <w:lang w:val="en-MY" w:eastAsia="zh-CN"/>
+        </w:rPr>
+        <w:t>5.3</w:t>
+      </w:r>
+      <w:r>
+        <w:rPr>
+          <w:lang w:val="en-MY" w:eastAsia="zh-CN"/>
+        </w:rPr>
+        <w:t xml:space="preserve">, more than one defect arose not from incorrect syntax but from methodologically incorrect use of otherwise-correct code (target leakage; inconsistent </w:t>
+      </w:r>
+      <w:r>
+        <w:rPr>
+          <w:lang w:val="en-MY" w:eastAsia="zh-CN"/>
+        </w:rPr>
+        <w:t>name casing comparison</w:t>
+      </w:r>
+      <w:r>
+        <w:rPr>
+          <w:lang w:val="en-MY" w:eastAsia="zh-CN"/>
+        </w:rPr>
+        <w:t>), underscoring that validation of a forecasting pipeline requires more than confirming it runs without error.</w:t>
       </w:r>
     </w:p>
     <w:p>
@@ -6549,18 +7288,423 @@
           <w14:ligatures w14:val="standardContextual"/>
         </w:rPr>
       </w:pPr>
-      <w:r>
+    </w:p>
+    <w:p>
+      <w:pPr>
+        <w:pStyle w:val="Heading2"/>
+      </w:pPr>
+      <w:r>
+        <w:t>Reflection</w:t>
+      </w:r>
+    </w:p>
+    <w:p>
+      <w:pPr>
+        <w:spacing w:after="160"/>
+      </w:pPr>
+      <w:r>
+        <w:t xml:space="preserve">The most valuable working practice adopted during this project was insisting that every function be executed against real or realistic synthetic data before being considered finished, rather than relying on code review alone. Several of the defects recorded in Section </w:t>
+      </w:r>
+      <w:r>
+        <w:t>5.3</w:t>
+      </w:r>
+      <w:r>
+        <w:t xml:space="preserve"> — particularly the target-leakage </w:t>
+      </w:r>
+      <w:r>
+        <w:t>problem</w:t>
+      </w:r>
+      <w:r>
+        <w:t xml:space="preserve"> — produce code that runs without raising an exception and returns plausible-looking number</w:t>
+      </w:r>
+      <w:r>
+        <w:t>s. This</w:t>
+      </w:r>
+      <w:r>
+        <w:t xml:space="preserve"> would very plausibly have gone unnoticed without direct, deliberate testing against known scenarios.</w:t>
+      </w:r>
+    </w:p>
+    <w:p>
+      <w:pPr>
+        <w:spacing w:after="160"/>
+      </w:pPr>
+      <w:r>
+        <w:t xml:space="preserve">A secondary lesson was the importance of stating data limitations honestly rather than working around them. The decision to report that the real </w:t>
+      </w:r>
+      <w:r>
+        <w:t xml:space="preserve">annual </w:t>
+      </w:r>
+      <w:r>
+        <w:t xml:space="preserve">dataset </w:t>
+      </w:r>
+      <w:r>
+        <w:t xml:space="preserve">does not reach the </w:t>
+      </w:r>
+      <w:r>
+        <w:t>minimum requirement of the amount of data needed</w:t>
+      </w:r>
+      <w:r>
+        <w:t>, rather than quietly reducing the validation threshold to make it pass, is judged in retrospect to be the right choice: it surfaces a genuine constraint on the current system (short history) that future work should address, rather than obscuring it behind a technically-passing but practically meaningless test.</w:t>
+      </w:r>
+    </w:p>
+    <w:p>
+      <w:pPr>
         <w:rPr>
           <w:rFonts w:eastAsiaTheme="majorEastAsia" w:cstheme="majorBidi"/>
           <w:color w:val="2F5496" w:themeColor="accent1" w:themeShade="BF"/>
           <w:kern w:val="2"/>
           <w:sz w:val="28"/>
           <w:szCs w:val="26"/>
-          <w:lang w:val="en-MY" w:eastAsia="zh-CN"/>
+          <w:lang w:eastAsia="zh-CN"/>
           <w14:ligatures w14:val="standardContextual"/>
         </w:rPr>
-        <w:t>Timeline and Milestone Tracking</w:t>
-      </w:r>
+      </w:pPr>
+    </w:p>
+    <w:p>
+      <w:pPr>
+        <w:pStyle w:val="Heading1"/>
+        <w:jc w:val="both"/>
+      </w:pPr>
+      <w:r>
+        <w:t>Conclusion</w:t>
+      </w:r>
+    </w:p>
+    <w:p>
+      <w:pPr>
+        <w:rPr>
+          <w:lang w:val="en-MY" w:eastAsia="zh-CN"/>
+        </w:rPr>
+      </w:pPr>
+      <w:r>
+        <w:rPr>
+          <w:lang w:val="en-MY" w:eastAsia="zh-CN"/>
+        </w:rPr>
+        <w:t>This project delivered a working, tested pipeline that ingests New Zealand Police crime</w:t>
+      </w:r>
+      <w:r>
+        <w:rPr>
+          <w:lang w:val="en-MY" w:eastAsia="zh-CN"/>
+        </w:rPr>
+        <w:t xml:space="preserve"> </w:t>
+      </w:r>
+      <w:r>
+        <w:rPr>
+          <w:lang w:val="en-MY" w:eastAsia="zh-CN"/>
+        </w:rPr>
+        <w:t xml:space="preserve">count exports across several real-world layouts, cleans and restructures them into an analysis-ready form, forecasts future crime counts using three independent and cross-validated modelling approaches, and provides the groundwork for population-adjusted, geographically-visualised reporting. </w:t>
+      </w:r>
+    </w:p>
+    <w:p>
+      <w:pPr>
+        <w:rPr>
+          <w:lang w:val="en-MY" w:eastAsia="zh-CN"/>
+        </w:rPr>
+      </w:pPr>
+    </w:p>
+    <w:p>
+      <w:pPr>
+        <w:rPr>
+          <w:lang w:val="en-MY" w:eastAsia="zh-CN"/>
+        </w:rPr>
+      </w:pPr>
+      <w:r>
+        <w:rPr>
+          <w:lang w:val="en-MY" w:eastAsia="zh-CN"/>
+        </w:rPr>
+        <w:t>The system's central strength is that its components were validated by direct execution throughout development, which surfaced and allowed correction of several defects — target leakage, inconsistent model evaluation, and a model-selection bug — that would not have been obvious from the code alone.</w:t>
+      </w:r>
+    </w:p>
+    <w:p>
+      <w:pPr>
+        <w:rPr>
+          <w:lang w:val="en-MY" w:eastAsia="zh-CN"/>
+        </w:rPr>
+      </w:pPr>
+    </w:p>
+    <w:p>
+      <w:pPr>
+        <w:pStyle w:val="Heading2"/>
+      </w:pPr>
+      <w:r>
+        <w:t>Limitations</w:t>
+      </w:r>
+    </w:p>
+    <w:p>
+      <w:pPr>
+        <w:pStyle w:val="ListParagraph"/>
+        <w:numPr>
+          <w:ilvl w:val="0"/>
+          <w:numId w:val="16"/>
+        </w:numPr>
+        <w:rPr>
+          <w:lang w:val="en-MY" w:eastAsia="zh-CN"/>
+        </w:rPr>
+      </w:pPr>
+      <w:r>
+        <w:rPr>
+          <w:lang w:val="en-MY" w:eastAsia="zh-CN"/>
+        </w:rPr>
+        <w:t xml:space="preserve">The real </w:t>
+      </w:r>
+      <w:r>
+        <w:rPr>
+          <w:lang w:val="en-MY" w:eastAsia="zh-CN"/>
+        </w:rPr>
+        <w:t>annual</w:t>
+      </w:r>
+      <w:r>
+        <w:rPr>
+          <w:lang w:val="en-MY" w:eastAsia="zh-CN"/>
+        </w:rPr>
+        <w:t xml:space="preserve"> crime history currently available per district (approximately 35 months) is shorter than the feature set's minimum requirement</w:t>
+      </w:r>
+      <w:r>
+        <w:rPr>
+          <w:lang w:val="en-MY" w:eastAsia="zh-CN"/>
+        </w:rPr>
+        <w:t xml:space="preserve"> for walk-forward cross-validation.</w:t>
+      </w:r>
+    </w:p>
+    <w:p>
+      <w:pPr>
+        <w:pStyle w:val="ListParagraph"/>
+        <w:numPr>
+          <w:ilvl w:val="0"/>
+          <w:numId w:val="16"/>
+        </w:numPr>
+        <w:rPr>
+          <w:lang w:val="en-MY" w:eastAsia="zh-CN"/>
+        </w:rPr>
+      </w:pPr>
+      <w:r>
+        <w:rPr>
+          <w:lang w:val="en-MY" w:eastAsia="zh-CN"/>
+        </w:rPr>
+        <w:t xml:space="preserve">Population data used for per-capita normalisation is a single </w:t>
+      </w:r>
+      <w:r>
+        <w:rPr>
+          <w:lang w:val="en-MY" w:eastAsia="zh-CN"/>
+        </w:rPr>
+        <w:t>2023-year</w:t>
+      </w:r>
+      <w:r>
+        <w:rPr>
+          <w:lang w:val="en-MY" w:eastAsia="zh-CN"/>
+        </w:rPr>
+        <w:t xml:space="preserve"> </w:t>
+      </w:r>
+      <w:proofErr w:type="spellStart"/>
+      <w:r>
+        <w:rPr>
+          <w:lang w:val="en-MY" w:eastAsia="zh-CN"/>
+        </w:rPr>
+        <w:t>meshb</w:t>
+      </w:r>
+      <w:r>
+        <w:rPr>
+          <w:lang w:val="en-MY" w:eastAsia="zh-CN"/>
+        </w:rPr>
+        <w:t>lock</w:t>
+      </w:r>
+      <w:proofErr w:type="spellEnd"/>
+      <w:r>
+        <w:rPr>
+          <w:lang w:val="en-MY" w:eastAsia="zh-CN"/>
+        </w:rPr>
+        <w:t xml:space="preserve"> rather than a genuine year-by-year series, limiting rate-based analysis to a rescaling of the count series rather than an independently informative signal.</w:t>
+      </w:r>
+    </w:p>
+    <w:p>
+      <w:pPr>
+        <w:pStyle w:val="ListParagraph"/>
+        <w:numPr>
+          <w:ilvl w:val="0"/>
+          <w:numId w:val="16"/>
+        </w:numPr>
+        <w:rPr>
+          <w:lang w:val="en-MY" w:eastAsia="zh-CN"/>
+        </w:rPr>
+      </w:pPr>
+      <w:r>
+        <w:rPr>
+          <w:lang w:val="en-MY" w:eastAsia="zh-CN"/>
+        </w:rPr>
+        <w:t>Cross-validation metrics carry a mild, documented optimism bias because hyperparameter tuning is not fully nested within each validation fold.</w:t>
+      </w:r>
+    </w:p>
+    <w:p>
+      <w:pPr>
+        <w:rPr>
+          <w:lang w:val="en-MY" w:eastAsia="zh-CN"/>
+        </w:rPr>
+      </w:pPr>
+    </w:p>
+    <w:p>
+      <w:pPr>
+        <w:pStyle w:val="Heading2"/>
+      </w:pPr>
+      <w:r>
+        <w:t>Future Work</w:t>
+      </w:r>
+    </w:p>
+    <w:p>
+      <w:pPr>
+        <w:rPr>
+          <w:lang w:val="en-MY" w:eastAsia="zh-CN"/>
+        </w:rPr>
+      </w:pPr>
+      <w:r>
+        <w:rPr>
+          <w:lang w:val="en-MY" w:eastAsia="zh-CN"/>
+        </w:rPr>
+        <w:t xml:space="preserve">While the New Zealand Crime Rate Forecasting Application successfully establishes a functional, end-to-end analytical pipeline, two primary structural limitations remain. First, the real </w:t>
+      </w:r>
+      <w:r>
+        <w:rPr>
+          <w:lang w:val="en-MY" w:eastAsia="zh-CN"/>
+        </w:rPr>
+        <w:t>annual</w:t>
+      </w:r>
+      <w:r>
+        <w:rPr>
+          <w:lang w:val="en-MY" w:eastAsia="zh-CN"/>
+        </w:rPr>
+        <w:t xml:space="preserve"> historical crime series currently available is relatively short, which constrains the complexity </w:t>
+      </w:r>
+      <w:r>
+        <w:rPr>
+          <w:lang w:val="en-MY" w:eastAsia="zh-CN"/>
+        </w:rPr>
+        <w:t xml:space="preserve">for </w:t>
+      </w:r>
+      <w:r>
+        <w:rPr>
+          <w:lang w:val="en-MY" w:eastAsia="zh-CN"/>
+        </w:rPr>
+        <w:t>walk-forward cross-validation process</w:t>
+      </w:r>
+      <w:r>
+        <w:rPr>
+          <w:lang w:val="en-MY" w:eastAsia="zh-CN"/>
+        </w:rPr>
+        <w:t>. Second, the population-adjusted normalization layer relies on a single-year (2023) population snapshot rather than a dynamic, multi-year time series. To address these constraints and further enhance the system's analytical depth, several key directions are recommended for future work.</w:t>
+      </w:r>
+    </w:p>
+    <w:p>
+      <w:pPr>
+        <w:rPr>
+          <w:lang w:val="en-MY" w:eastAsia="zh-CN"/>
+        </w:rPr>
+      </w:pPr>
+    </w:p>
+    <w:p>
+      <w:pPr>
+        <w:rPr>
+          <w:lang w:val="en-MY" w:eastAsia="zh-CN"/>
+        </w:rPr>
+      </w:pPr>
+      <w:r>
+        <w:rPr>
+          <w:lang w:val="en-MY" w:eastAsia="zh-CN"/>
+        </w:rPr>
+        <w:t xml:space="preserve">To resolve data depth and feature constraints, future iterations should focus on accumulating additional </w:t>
+      </w:r>
+      <w:r>
+        <w:rPr>
+          <w:lang w:val="en-MY" w:eastAsia="zh-CN"/>
+        </w:rPr>
+        <w:t>years</w:t>
+      </w:r>
+      <w:r>
+        <w:rPr>
+          <w:lang w:val="en-MY" w:eastAsia="zh-CN"/>
+        </w:rPr>
+        <w:t xml:space="preserve"> of real district-level history as new exports are published by New Zealand Police. Furthermore, system validation should be systematically expanded across all twelve Police Districts, while continuously testing the data_loader.py ingestion layer against future export vintages to ensure ongoing resilience against unexpected schema changes.</w:t>
+      </w:r>
+    </w:p>
+    <w:p>
+      <w:pPr>
+        <w:rPr>
+          <w:lang w:val="en-MY" w:eastAsia="zh-CN"/>
+        </w:rPr>
+      </w:pPr>
+    </w:p>
+    <w:p>
+      <w:pPr>
+        <w:rPr>
+          <w:lang w:val="en-MY" w:eastAsia="zh-CN"/>
+        </w:rPr>
+      </w:pPr>
+      <w:r>
+        <w:rPr>
+          <w:lang w:val="en-MY" w:eastAsia="zh-CN"/>
+        </w:rPr>
+        <w:t xml:space="preserve">To improve geospatial and demographic accuracy, the current fixed-denominator rescaling method should be upgraded by incorporating Stats NZ's time-varying subnational population estimates, which are published annually at the Territorial Authority level for non-census </w:t>
+      </w:r>
+      <w:r>
+        <w:rPr>
+          <w:lang w:val="en-MY" w:eastAsia="zh-CN"/>
+        </w:rPr>
+        <w:lastRenderedPageBreak/>
+        <w:t>years. Integrating these dynamic population vectors will enable genuine per-capita trend analysis over extended temporal horizons. On the model</w:t>
+      </w:r>
+      <w:r>
+        <w:rPr>
+          <w:lang w:val="en-MY" w:eastAsia="zh-CN"/>
+        </w:rPr>
+        <w:t>l</w:t>
+      </w:r>
+      <w:r>
+        <w:rPr>
+          <w:lang w:val="en-MY" w:eastAsia="zh-CN"/>
+        </w:rPr>
+        <w:t>ing side, transitioning from independent single-district forecasting to a multivariate framework</w:t>
+      </w:r>
+      <w:r>
+        <w:rPr>
+          <w:lang w:val="en-MY" w:eastAsia="zh-CN"/>
+        </w:rPr>
+        <w:t xml:space="preserve"> </w:t>
+      </w:r>
+      <w:r>
+        <w:rPr>
+          <w:lang w:val="en-MY" w:eastAsia="zh-CN"/>
+        </w:rPr>
+        <w:t xml:space="preserve">such as Vector Autoregression (VAR) or </w:t>
+      </w:r>
+      <w:proofErr w:type="spellStart"/>
+      <w:r>
+        <w:rPr>
+          <w:lang w:val="en-MY" w:eastAsia="zh-CN"/>
+        </w:rPr>
+        <w:t>spatio</w:t>
+      </w:r>
+      <w:proofErr w:type="spellEnd"/>
+      <w:r>
+        <w:rPr>
+          <w:lang w:val="en-MY" w:eastAsia="zh-CN"/>
+        </w:rPr>
+        <w:t>-temporal neural networks</w:t>
+      </w:r>
+      <w:r>
+        <w:rPr>
+          <w:lang w:val="en-MY" w:eastAsia="zh-CN"/>
+        </w:rPr>
+        <w:t xml:space="preserve"> </w:t>
+      </w:r>
+      <w:r>
+        <w:rPr>
+          <w:lang w:val="en-MY" w:eastAsia="zh-CN"/>
+        </w:rPr>
+        <w:t>would allow the system to capture spatial cross-correlations and inter-district dependency patterns that single-district models inherently miss.</w:t>
+      </w:r>
+    </w:p>
+    <w:p>
+      <w:pPr>
+        <w:rPr>
+          <w:lang w:val="en-MY" w:eastAsia="zh-CN"/>
+        </w:rPr>
+      </w:pPr>
     </w:p>
     <w:p>
       <w:pPr>
@@ -6576,51 +7720,10 @@
       </w:pPr>
       <w:r>
         <w:rPr>
-          <w:rFonts w:eastAsiaTheme="majorEastAsia" w:cstheme="majorBidi"/>
-          <w:color w:val="2F5496" w:themeColor="accent1" w:themeShade="BF"/>
-          <w:kern w:val="2"/>
-          <w:sz w:val="28"/>
-          <w:szCs w:val="26"/>
-          <w:lang w:val="en-MY" w:eastAsia="zh-CN"/>
-          <w14:ligatures w14:val="standardContextual"/>
-        </w:rPr>
-        <w:t>Reflection</w:t>
-      </w:r>
-    </w:p>
-    <w:p>
-      <w:pPr>
-        <w:rPr>
-          <w:rFonts w:eastAsiaTheme="majorEastAsia" w:cstheme="majorBidi"/>
-          <w:color w:val="2F5496" w:themeColor="accent1" w:themeShade="BF"/>
-          <w:kern w:val="2"/>
-          <w:sz w:val="28"/>
-          <w:szCs w:val="26"/>
-          <w:lang w:val="en-MY" w:eastAsia="zh-CN"/>
-          <w14:ligatures w14:val="standardContextual"/>
-        </w:rPr>
-      </w:pPr>
-    </w:p>
-    <w:p>
-      <w:pPr>
-        <w:pStyle w:val="Heading1"/>
-        <w:jc w:val="both"/>
-      </w:pPr>
-      <w:r>
-        <w:t>Conclusion</w:t>
-      </w:r>
-    </w:p>
-    <w:p>
-      <w:pPr>
-        <w:rPr>
-          <w:rFonts w:eastAsiaTheme="majorEastAsia" w:cstheme="majorBidi"/>
-          <w:color w:val="2F5496" w:themeColor="accent1" w:themeShade="BF"/>
-          <w:kern w:val="2"/>
-          <w:sz w:val="28"/>
-          <w:szCs w:val="26"/>
-          <w:lang w:val="en-MY" w:eastAsia="zh-CN"/>
-          <w14:ligatures w14:val="standardContextual"/>
-        </w:rPr>
-      </w:pPr>
+          <w:lang w:val="en-MY" w:eastAsia="zh-CN"/>
+        </w:rPr>
+        <w:t xml:space="preserve">Finally, regarding model evaluation and system deployment, implementing nested cross-validation would provide decision-grade, fully unbiased performance metrics by decoupling hyperparameter tuning from outer-loop model evaluation, particularly where the additional computational overhead is justified. </w:t>
+      </w:r>
     </w:p>
     <w:p>
       <w:pPr>
@@ -6642,6 +7745,232 @@
 <file path=word/numbering.xml><?xml version="1.0" encoding="utf-8"?>
 <w:numbering xmlns:wpc="http://schemas.microsoft.com/office/word/2010/wordprocessingCanvas" xmlns:cx="http://schemas.microsoft.com/office/drawing/2014/chartex" xmlns:cx1="http://schemas.microsoft.com/office/drawing/2015/9/8/chartex" xmlns:cx2="http://schemas.microsoft.com/office/drawing/2015/10/21/chartex" xmlns:cx3="http://schemas.microsoft.com/office/drawing/2016/5/9/chartex" xmlns:cx4="http://schemas.microsoft.com/office/drawing/2016/5/10/chartex" xmlns:cx5="http://schemas.microsoft.com/office/drawing/2016/5/11/chartex" xmlns:cx6="http://schemas.microsoft.com/office/drawing/2016/5/12/chartex" xmlns:cx7="http://schemas.microsoft.com/office/drawing/2016/5/13/chartex" xmlns:cx8="http://schemas.microsoft.com/office/drawing/2016/5/14/chartex" xmlns:mc="http://schemas.openxmlformats.org/markup-compatibility/2006" xmlns:aink="http://schemas.microsoft.com/office/drawing/2016/ink" xmlns:am3d="http://schemas.microsoft.com/office/drawing/2017/model3d" xmlns:o="urn:schemas-microsoft-com:office:office" xmlns:oel="http://schemas.microsoft.com/office/2019/extlst" xmlns:r="http://schemas.openxmlformats.org/officeDocument/2006/relationships" xmlns:m="http://schemas.openxmlformats.org/officeDocument/2006/math" xmlns:v="urn:schemas-microsoft-com:vml" xmlns:wp14="http://schemas.microsoft.com/office/word/2010/wordprocessingDrawing" xmlns:wp="http://schemas.openxmlformats.org/drawingml/2006/wordprocessingDrawing" xmlns:w10="urn:schemas-microsoft-com:office:word" xmlns:w="http://schemas.openxmlformats.org/wordprocessingml/2006/main" xmlns:w14="http://schemas.microsoft.com/office/word/2010/wordml" xmlns:w15="http://schemas.microsoft.com/office/word/2012/wordml" xmlns:w16cex="http://schemas.microsoft.com/office/word/2018/wordml/cex" xmlns:w16cid="http://schemas.microsoft.com/office/word/2016/wordml/cid" xmlns:w16="http://schemas.microsoft.com/office/word/2018/wordml" xmlns:w16du="http://schemas.microsoft.com/office/word/2023/wordml/word16du" xmlns:w16sdtdh="http://schemas.microsoft.com/office/word/2020/wordml/sdtdatahash" xmlns:w16sdtfl="http://schemas.microsoft.com/office/word/2024/wordml/sdtformatlock" xmlns:w16se="http://schemas.microsoft.com/office/word/2015/wordml/symex" xmlns:wpg="http://schemas.microsoft.com/office/word/2010/wordprocessingGroup" xmlns:wpi="http://schemas.microsoft.com/office/word/2010/wordprocessingInk" xmlns:wne="http://schemas.microsoft.com/office/word/2006/wordml" xmlns:wps="http://schemas.microsoft.com/office/word/2010/wordprocessingShape" mc:Ignorable="w14 w15 w16se w16cid w16 w16cex w16sdtdh w16sdtfl w16du wp14">
   <w:abstractNum w:abstractNumId="0" w15:restartNumberingAfterBreak="0">
+    <w:nsid w:val="04B25D99"/>
+    <w:multiLevelType w:val="hybridMultilevel"/>
+    <w:tmpl w:val="F4EA5408"/>
+    <w:lvl w:ilvl="0" w:tplc="44090001">
+      <w:start w:val="1"/>
+      <w:numFmt w:val="bullet"/>
+      <w:lvlText w:val=""/>
+      <w:lvlJc w:val="left"/>
+      <w:pPr>
+        <w:ind w:left="720" w:hanging="360"/>
+      </w:pPr>
+      <w:rPr>
+        <w:rFonts w:ascii="Symbol" w:hAnsi="Symbol" w:hint="default"/>
+      </w:rPr>
+    </w:lvl>
+    <w:lvl w:ilvl="1" w:tplc="44090003" w:tentative="1">
+      <w:start w:val="1"/>
+      <w:numFmt w:val="bullet"/>
+      <w:lvlText w:val="o"/>
+      <w:lvlJc w:val="left"/>
+      <w:pPr>
+        <w:ind w:left="1440" w:hanging="360"/>
+      </w:pPr>
+      <w:rPr>
+        <w:rFonts w:ascii="Courier New" w:hAnsi="Courier New" w:cs="Courier New" w:hint="default"/>
+      </w:rPr>
+    </w:lvl>
+    <w:lvl w:ilvl="2" w:tplc="44090005" w:tentative="1">
+      <w:start w:val="1"/>
+      <w:numFmt w:val="bullet"/>
+      <w:lvlText w:val=""/>
+      <w:lvlJc w:val="left"/>
+      <w:pPr>
+        <w:ind w:left="2160" w:hanging="360"/>
+      </w:pPr>
+      <w:rPr>
+        <w:rFonts w:ascii="Wingdings" w:hAnsi="Wingdings" w:hint="default"/>
+      </w:rPr>
+    </w:lvl>
+    <w:lvl w:ilvl="3" w:tplc="44090001" w:tentative="1">
+      <w:start w:val="1"/>
+      <w:numFmt w:val="bullet"/>
+      <w:lvlText w:val=""/>
+      <w:lvlJc w:val="left"/>
+      <w:pPr>
+        <w:ind w:left="2880" w:hanging="360"/>
+      </w:pPr>
+      <w:rPr>
+        <w:rFonts w:ascii="Symbol" w:hAnsi="Symbol" w:hint="default"/>
+      </w:rPr>
+    </w:lvl>
+    <w:lvl w:ilvl="4" w:tplc="44090003" w:tentative="1">
+      <w:start w:val="1"/>
+      <w:numFmt w:val="bullet"/>
+      <w:lvlText w:val="o"/>
+      <w:lvlJc w:val="left"/>
+      <w:pPr>
+        <w:ind w:left="3600" w:hanging="360"/>
+      </w:pPr>
+      <w:rPr>
+        <w:rFonts w:ascii="Courier New" w:hAnsi="Courier New" w:cs="Courier New" w:hint="default"/>
+      </w:rPr>
+    </w:lvl>
+    <w:lvl w:ilvl="5" w:tplc="44090005" w:tentative="1">
+      <w:start w:val="1"/>
+      <w:numFmt w:val="bullet"/>
+      <w:lvlText w:val=""/>
+      <w:lvlJc w:val="left"/>
+      <w:pPr>
+        <w:ind w:left="4320" w:hanging="360"/>
+      </w:pPr>
+      <w:rPr>
+        <w:rFonts w:ascii="Wingdings" w:hAnsi="Wingdings" w:hint="default"/>
+      </w:rPr>
+    </w:lvl>
+    <w:lvl w:ilvl="6" w:tplc="44090001" w:tentative="1">
+      <w:start w:val="1"/>
+      <w:numFmt w:val="bullet"/>
+      <w:lvlText w:val=""/>
+      <w:lvlJc w:val="left"/>
+      <w:pPr>
+        <w:ind w:left="5040" w:hanging="360"/>
+      </w:pPr>
+      <w:rPr>
+        <w:rFonts w:ascii="Symbol" w:hAnsi="Symbol" w:hint="default"/>
+      </w:rPr>
+    </w:lvl>
+    <w:lvl w:ilvl="7" w:tplc="44090003" w:tentative="1">
+      <w:start w:val="1"/>
+      <w:numFmt w:val="bullet"/>
+      <w:lvlText w:val="o"/>
+      <w:lvlJc w:val="left"/>
+      <w:pPr>
+        <w:ind w:left="5760" w:hanging="360"/>
+      </w:pPr>
+      <w:rPr>
+        <w:rFonts w:ascii="Courier New" w:hAnsi="Courier New" w:cs="Courier New" w:hint="default"/>
+      </w:rPr>
+    </w:lvl>
+    <w:lvl w:ilvl="8" w:tplc="44090005" w:tentative="1">
+      <w:start w:val="1"/>
+      <w:numFmt w:val="bullet"/>
+      <w:lvlText w:val=""/>
+      <w:lvlJc w:val="left"/>
+      <w:pPr>
+        <w:ind w:left="6480" w:hanging="360"/>
+      </w:pPr>
+      <w:rPr>
+        <w:rFonts w:ascii="Wingdings" w:hAnsi="Wingdings" w:hint="default"/>
+      </w:rPr>
+    </w:lvl>
+  </w:abstractNum>
+  <w:abstractNum w:abstractNumId="1" w15:restartNumberingAfterBreak="0">
+    <w:nsid w:val="092450DD"/>
+    <w:multiLevelType w:val="hybridMultilevel"/>
+    <w:tmpl w:val="FB8A8572"/>
+    <w:lvl w:ilvl="0" w:tplc="44090001">
+      <w:start w:val="1"/>
+      <w:numFmt w:val="bullet"/>
+      <w:lvlText w:val=""/>
+      <w:lvlJc w:val="left"/>
+      <w:pPr>
+        <w:ind w:left="720" w:hanging="360"/>
+      </w:pPr>
+      <w:rPr>
+        <w:rFonts w:ascii="Symbol" w:hAnsi="Symbol" w:hint="default"/>
+      </w:rPr>
+    </w:lvl>
+    <w:lvl w:ilvl="1" w:tplc="44090003" w:tentative="1">
+      <w:start w:val="1"/>
+      <w:numFmt w:val="bullet"/>
+      <w:lvlText w:val="o"/>
+      <w:lvlJc w:val="left"/>
+      <w:pPr>
+        <w:ind w:left="1440" w:hanging="360"/>
+      </w:pPr>
+      <w:rPr>
+        <w:rFonts w:ascii="Courier New" w:hAnsi="Courier New" w:cs="Courier New" w:hint="default"/>
+      </w:rPr>
+    </w:lvl>
+    <w:lvl w:ilvl="2" w:tplc="44090005" w:tentative="1">
+      <w:start w:val="1"/>
+      <w:numFmt w:val="bullet"/>
+      <w:lvlText w:val=""/>
+      <w:lvlJc w:val="left"/>
+      <w:pPr>
+        <w:ind w:left="2160" w:hanging="360"/>
+      </w:pPr>
+      <w:rPr>
+        <w:rFonts w:ascii="Wingdings" w:hAnsi="Wingdings" w:hint="default"/>
+      </w:rPr>
+    </w:lvl>
+    <w:lvl w:ilvl="3" w:tplc="44090001" w:tentative="1">
+      <w:start w:val="1"/>
+      <w:numFmt w:val="bullet"/>
+      <w:lvlText w:val=""/>
+      <w:lvlJc w:val="left"/>
+      <w:pPr>
+        <w:ind w:left="2880" w:hanging="360"/>
+      </w:pPr>
+      <w:rPr>
+        <w:rFonts w:ascii="Symbol" w:hAnsi="Symbol" w:hint="default"/>
+      </w:rPr>
+    </w:lvl>
+    <w:lvl w:ilvl="4" w:tplc="44090003" w:tentative="1">
+      <w:start w:val="1"/>
+      <w:numFmt w:val="bullet"/>
+      <w:lvlText w:val="o"/>
+      <w:lvlJc w:val="left"/>
+      <w:pPr>
+        <w:ind w:left="3600" w:hanging="360"/>
+      </w:pPr>
+      <w:rPr>
+        <w:rFonts w:ascii="Courier New" w:hAnsi="Courier New" w:cs="Courier New" w:hint="default"/>
+      </w:rPr>
+    </w:lvl>
+    <w:lvl w:ilvl="5" w:tplc="44090005" w:tentative="1">
+      <w:start w:val="1"/>
+      <w:numFmt w:val="bullet"/>
+      <w:lvlText w:val=""/>
+      <w:lvlJc w:val="left"/>
+      <w:pPr>
+        <w:ind w:left="4320" w:hanging="360"/>
+      </w:pPr>
+      <w:rPr>
+        <w:rFonts w:ascii="Wingdings" w:hAnsi="Wingdings" w:hint="default"/>
+      </w:rPr>
+    </w:lvl>
+    <w:lvl w:ilvl="6" w:tplc="44090001" w:tentative="1">
+      <w:start w:val="1"/>
+      <w:numFmt w:val="bullet"/>
+      <w:lvlText w:val=""/>
+      <w:lvlJc w:val="left"/>
+      <w:pPr>
+        <w:ind w:left="5040" w:hanging="360"/>
+      </w:pPr>
+      <w:rPr>
+        <w:rFonts w:ascii="Symbol" w:hAnsi="Symbol" w:hint="default"/>
+      </w:rPr>
+    </w:lvl>
+    <w:lvl w:ilvl="7" w:tplc="44090003" w:tentative="1">
+      <w:start w:val="1"/>
+      <w:numFmt w:val="bullet"/>
+      <w:lvlText w:val="o"/>
+      <w:lvlJc w:val="left"/>
+      <w:pPr>
+        <w:ind w:left="5760" w:hanging="360"/>
+      </w:pPr>
+      <w:rPr>
+        <w:rFonts w:ascii="Courier New" w:hAnsi="Courier New" w:cs="Courier New" w:hint="default"/>
+      </w:rPr>
+    </w:lvl>
+    <w:lvl w:ilvl="8" w:tplc="44090005" w:tentative="1">
+      <w:start w:val="1"/>
+      <w:numFmt w:val="bullet"/>
+      <w:lvlText w:val=""/>
+      <w:lvlJc w:val="left"/>
+      <w:pPr>
+        <w:ind w:left="6480" w:hanging="360"/>
+      </w:pPr>
+      <w:rPr>
+        <w:rFonts w:ascii="Wingdings" w:hAnsi="Wingdings" w:hint="default"/>
+      </w:rPr>
+    </w:lvl>
+  </w:abstractNum>
+  <w:abstractNum w:abstractNumId="2" w15:restartNumberingAfterBreak="0">
     <w:nsid w:val="095A7EEA"/>
     <w:multiLevelType w:val="hybridMultilevel"/>
     <w:tmpl w:val="5EBCD128"/>
@@ -6754,7 +8083,7 @@
       </w:rPr>
     </w:lvl>
   </w:abstractNum>
-  <w:abstractNum w:abstractNumId="1" w15:restartNumberingAfterBreak="0">
+  <w:abstractNum w:abstractNumId="3" w15:restartNumberingAfterBreak="0">
     <w:nsid w:val="0AE221BE"/>
     <w:multiLevelType w:val="hybridMultilevel"/>
     <w:tmpl w:val="42FE8CB2"/>
@@ -6867,10 +8196,10 @@
       </w:rPr>
     </w:lvl>
   </w:abstractNum>
-  <w:abstractNum w:abstractNumId="2" w15:restartNumberingAfterBreak="0">
+  <w:abstractNum w:abstractNumId="4" w15:restartNumberingAfterBreak="0">
     <w:nsid w:val="0E7147F5"/>
     <w:multiLevelType w:val="hybridMultilevel"/>
-    <w:tmpl w:val="AC640B64"/>
+    <w:tmpl w:val="684ED200"/>
     <w:lvl w:ilvl="0" w:tplc="44090001">
       <w:start w:val="1"/>
       <w:numFmt w:val="bullet"/>
@@ -6883,104 +8212,103 @@
         <w:rFonts w:ascii="Symbol" w:hAnsi="Symbol" w:hint="default"/>
       </w:rPr>
     </w:lvl>
-    <w:lvl w:ilvl="1" w:tplc="44090003" w:tentative="1">
+    <w:lvl w:ilvl="1" w:tplc="F5623C88">
+      <w:numFmt w:val="bullet"/>
+      <w:lvlText w:val="•"/>
+      <w:lvlJc w:val="left"/>
+      <w:pPr>
+        <w:ind w:left="1800" w:hanging="720"/>
+      </w:pPr>
+      <w:rPr>
+        <w:rFonts w:ascii="Times New Roman" w:eastAsiaTheme="minorHAnsi" w:hAnsi="Times New Roman" w:cs="Times New Roman" w:hint="default"/>
+      </w:rPr>
+    </w:lvl>
+    <w:lvl w:ilvl="2" w:tplc="44090005" w:tentative="1">
+      <w:start w:val="1"/>
+      <w:numFmt w:val="bullet"/>
+      <w:lvlText w:val=""/>
+      <w:lvlJc w:val="left"/>
+      <w:pPr>
+        <w:ind w:left="2160" w:hanging="360"/>
+      </w:pPr>
+      <w:rPr>
+        <w:rFonts w:ascii="Wingdings" w:hAnsi="Wingdings" w:hint="default"/>
+      </w:rPr>
+    </w:lvl>
+    <w:lvl w:ilvl="3" w:tplc="44090001" w:tentative="1">
+      <w:start w:val="1"/>
+      <w:numFmt w:val="bullet"/>
+      <w:lvlText w:val=""/>
+      <w:lvlJc w:val="left"/>
+      <w:pPr>
+        <w:ind w:left="2880" w:hanging="360"/>
+      </w:pPr>
+      <w:rPr>
+        <w:rFonts w:ascii="Symbol" w:hAnsi="Symbol" w:hint="default"/>
+      </w:rPr>
+    </w:lvl>
+    <w:lvl w:ilvl="4" w:tplc="44090003" w:tentative="1">
       <w:start w:val="1"/>
       <w:numFmt w:val="bullet"/>
       <w:lvlText w:val="o"/>
       <w:lvlJc w:val="left"/>
       <w:pPr>
-        <w:ind w:left="1440" w:hanging="360"/>
+        <w:ind w:left="3600" w:hanging="360"/>
       </w:pPr>
       <w:rPr>
         <w:rFonts w:ascii="Courier New" w:hAnsi="Courier New" w:cs="Courier New" w:hint="default"/>
       </w:rPr>
     </w:lvl>
-    <w:lvl w:ilvl="2" w:tplc="44090005" w:tentative="1">
+    <w:lvl w:ilvl="5" w:tplc="44090005" w:tentative="1">
       <w:start w:val="1"/>
       <w:numFmt w:val="bullet"/>
       <w:lvlText w:val=""/>
       <w:lvlJc w:val="left"/>
       <w:pPr>
-        <w:ind w:left="2160" w:hanging="360"/>
+        <w:ind w:left="4320" w:hanging="360"/>
       </w:pPr>
       <w:rPr>
         <w:rFonts w:ascii="Wingdings" w:hAnsi="Wingdings" w:hint="default"/>
       </w:rPr>
     </w:lvl>
-    <w:lvl w:ilvl="3" w:tplc="44090001" w:tentative="1">
+    <w:lvl w:ilvl="6" w:tplc="44090001" w:tentative="1">
       <w:start w:val="1"/>
       <w:numFmt w:val="bullet"/>
       <w:lvlText w:val=""/>
       <w:lvlJc w:val="left"/>
       <w:pPr>
-        <w:ind w:left="2880" w:hanging="360"/>
+        <w:ind w:left="5040" w:hanging="360"/>
       </w:pPr>
       <w:rPr>
         <w:rFonts w:ascii="Symbol" w:hAnsi="Symbol" w:hint="default"/>
       </w:rPr>
     </w:lvl>
-    <w:lvl w:ilvl="4" w:tplc="44090003" w:tentative="1">
+    <w:lvl w:ilvl="7" w:tplc="44090003" w:tentative="1">
       <w:start w:val="1"/>
       <w:numFmt w:val="bullet"/>
       <w:lvlText w:val="o"/>
       <w:lvlJc w:val="left"/>
       <w:pPr>
-        <w:ind w:left="3600" w:hanging="360"/>
+        <w:ind w:left="5760" w:hanging="360"/>
       </w:pPr>
       <w:rPr>
         <w:rFonts w:ascii="Courier New" w:hAnsi="Courier New" w:cs="Courier New" w:hint="default"/>
       </w:rPr>
     </w:lvl>
-    <w:lvl w:ilvl="5" w:tplc="44090005" w:tentative="1">
+    <w:lvl w:ilvl="8" w:tplc="44090005" w:tentative="1">
       <w:start w:val="1"/>
       <w:numFmt w:val="bullet"/>
       <w:lvlText w:val=""/>
       <w:lvlJc w:val="left"/>
       <w:pPr>
-        <w:ind w:left="4320" w:hanging="360"/>
+        <w:ind w:left="6480" w:hanging="360"/>
       </w:pPr>
       <w:rPr>
         <w:rFonts w:ascii="Wingdings" w:hAnsi="Wingdings" w:hint="default"/>
       </w:rPr>
     </w:lvl>
-    <w:lvl w:ilvl="6" w:tplc="44090001" w:tentative="1">
-      <w:start w:val="1"/>
-      <w:numFmt w:val="bullet"/>
-      <w:lvlText w:val=""/>
-      <w:lvlJc w:val="left"/>
-      <w:pPr>
-        <w:ind w:left="5040" w:hanging="360"/>
-      </w:pPr>
-      <w:rPr>
-        <w:rFonts w:ascii="Symbol" w:hAnsi="Symbol" w:hint="default"/>
-      </w:rPr>
-    </w:lvl>
-    <w:lvl w:ilvl="7" w:tplc="44090003" w:tentative="1">
-      <w:start w:val="1"/>
-      <w:numFmt w:val="bullet"/>
-      <w:lvlText w:val="o"/>
-      <w:lvlJc w:val="left"/>
-      <w:pPr>
-        <w:ind w:left="5760" w:hanging="360"/>
-      </w:pPr>
-      <w:rPr>
-        <w:rFonts w:ascii="Courier New" w:hAnsi="Courier New" w:cs="Courier New" w:hint="default"/>
-      </w:rPr>
-    </w:lvl>
-    <w:lvl w:ilvl="8" w:tplc="44090005" w:tentative="1">
-      <w:start w:val="1"/>
-      <w:numFmt w:val="bullet"/>
-      <w:lvlText w:val=""/>
-      <w:lvlJc w:val="left"/>
-      <w:pPr>
-        <w:ind w:left="6480" w:hanging="360"/>
-      </w:pPr>
-      <w:rPr>
-        <w:rFonts w:ascii="Wingdings" w:hAnsi="Wingdings" w:hint="default"/>
-      </w:rPr>
-    </w:lvl>
   </w:abstractNum>
-  <w:abstractNum w:abstractNumId="3" w15:restartNumberingAfterBreak="0">
+  <w:abstractNum w:abstractNumId="5" w15:restartNumberingAfterBreak="0">
     <w:nsid w:val="110A6937"/>
     <w:multiLevelType w:val="hybridMultilevel"/>
     <w:tmpl w:val="4574DA92"/>
@@ -7093,7 +8421,7 @@
       </w:rPr>
     </w:lvl>
   </w:abstractNum>
-  <w:abstractNum w:abstractNumId="4" w15:restartNumberingAfterBreak="0">
+  <w:abstractNum w:abstractNumId="6" w15:restartNumberingAfterBreak="0">
     <w:nsid w:val="18CE5B85"/>
     <w:multiLevelType w:val="hybridMultilevel"/>
     <w:tmpl w:val="842E617A"/>
@@ -7206,7 +8534,7 @@
       </w:rPr>
     </w:lvl>
   </w:abstractNum>
-  <w:abstractNum w:abstractNumId="5" w15:restartNumberingAfterBreak="0">
+  <w:abstractNum w:abstractNumId="7" w15:restartNumberingAfterBreak="0">
     <w:nsid w:val="1A7B17F7"/>
     <w:multiLevelType w:val="hybridMultilevel"/>
     <w:tmpl w:val="401CF4CE"/>
@@ -7319,7 +8647,7 @@
       </w:rPr>
     </w:lvl>
   </w:abstractNum>
-  <w:abstractNum w:abstractNumId="6" w15:restartNumberingAfterBreak="0">
+  <w:abstractNum w:abstractNumId="8" w15:restartNumberingAfterBreak="0">
     <w:nsid w:val="242B444F"/>
     <w:multiLevelType w:val="hybridMultilevel"/>
     <w:tmpl w:val="8F6A7B36"/>
@@ -7432,7 +8760,120 @@
       </w:rPr>
     </w:lvl>
   </w:abstractNum>
-  <w:abstractNum w:abstractNumId="7" w15:restartNumberingAfterBreak="0">
+  <w:abstractNum w:abstractNumId="9" w15:restartNumberingAfterBreak="0">
+    <w:nsid w:val="46C6537C"/>
+    <w:multiLevelType w:val="hybridMultilevel"/>
+    <w:tmpl w:val="EA9CE222"/>
+    <w:lvl w:ilvl="0" w:tplc="44090001">
+      <w:start w:val="1"/>
+      <w:numFmt w:val="bullet"/>
+      <w:lvlText w:val=""/>
+      <w:lvlJc w:val="left"/>
+      <w:pPr>
+        <w:ind w:left="720" w:hanging="360"/>
+      </w:pPr>
+      <w:rPr>
+        <w:rFonts w:ascii="Symbol" w:hAnsi="Symbol" w:hint="default"/>
+      </w:rPr>
+    </w:lvl>
+    <w:lvl w:ilvl="1" w:tplc="44090003" w:tentative="1">
+      <w:start w:val="1"/>
+      <w:numFmt w:val="bullet"/>
+      <w:lvlText w:val="o"/>
+      <w:lvlJc w:val="left"/>
+      <w:pPr>
+        <w:ind w:left="1440" w:hanging="360"/>
+      </w:pPr>
+      <w:rPr>
+        <w:rFonts w:ascii="Courier New" w:hAnsi="Courier New" w:cs="Courier New" w:hint="default"/>
+      </w:rPr>
+    </w:lvl>
+    <w:lvl w:ilvl="2" w:tplc="44090005" w:tentative="1">
+      <w:start w:val="1"/>
+      <w:numFmt w:val="bullet"/>
+      <w:lvlText w:val=""/>
+      <w:lvlJc w:val="left"/>
+      <w:pPr>
+        <w:ind w:left="2160" w:hanging="360"/>
+      </w:pPr>
+      <w:rPr>
+        <w:rFonts w:ascii="Wingdings" w:hAnsi="Wingdings" w:hint="default"/>
+      </w:rPr>
+    </w:lvl>
+    <w:lvl w:ilvl="3" w:tplc="44090001" w:tentative="1">
+      <w:start w:val="1"/>
+      <w:numFmt w:val="bullet"/>
+      <w:lvlText w:val=""/>
+      <w:lvlJc w:val="left"/>
+      <w:pPr>
+        <w:ind w:left="2880" w:hanging="360"/>
+      </w:pPr>
+      <w:rPr>
+        <w:rFonts w:ascii="Symbol" w:hAnsi="Symbol" w:hint="default"/>
+      </w:rPr>
+    </w:lvl>
+    <w:lvl w:ilvl="4" w:tplc="44090003" w:tentative="1">
+      <w:start w:val="1"/>
+      <w:numFmt w:val="bullet"/>
+      <w:lvlText w:val="o"/>
+      <w:lvlJc w:val="left"/>
+      <w:pPr>
+        <w:ind w:left="3600" w:hanging="360"/>
+      </w:pPr>
+      <w:rPr>
+        <w:rFonts w:ascii="Courier New" w:hAnsi="Courier New" w:cs="Courier New" w:hint="default"/>
+      </w:rPr>
+    </w:lvl>
+    <w:lvl w:ilvl="5" w:tplc="44090005" w:tentative="1">
+      <w:start w:val="1"/>
+      <w:numFmt w:val="bullet"/>
+      <w:lvlText w:val=""/>
+      <w:lvlJc w:val="left"/>
+      <w:pPr>
+        <w:ind w:left="4320" w:hanging="360"/>
+      </w:pPr>
+      <w:rPr>
+        <w:rFonts w:ascii="Wingdings" w:hAnsi="Wingdings" w:hint="default"/>
+      </w:rPr>
+    </w:lvl>
+    <w:lvl w:ilvl="6" w:tplc="44090001" w:tentative="1">
+      <w:start w:val="1"/>
+      <w:numFmt w:val="bullet"/>
+      <w:lvlText w:val=""/>
+      <w:lvlJc w:val="left"/>
+      <w:pPr>
+        <w:ind w:left="5040" w:hanging="360"/>
+      </w:pPr>
+      <w:rPr>
+        <w:rFonts w:ascii="Symbol" w:hAnsi="Symbol" w:hint="default"/>
+      </w:rPr>
+    </w:lvl>
+    <w:lvl w:ilvl="7" w:tplc="44090003" w:tentative="1">
+      <w:start w:val="1"/>
+      <w:numFmt w:val="bullet"/>
+      <w:lvlText w:val="o"/>
+      <w:lvlJc w:val="left"/>
+      <w:pPr>
+        <w:ind w:left="5760" w:hanging="360"/>
+      </w:pPr>
+      <w:rPr>
+        <w:rFonts w:ascii="Courier New" w:hAnsi="Courier New" w:cs="Courier New" w:hint="default"/>
+      </w:rPr>
+    </w:lvl>
+    <w:lvl w:ilvl="8" w:tplc="44090005" w:tentative="1">
+      <w:start w:val="1"/>
+      <w:numFmt w:val="bullet"/>
+      <w:lvlText w:val=""/>
+      <w:lvlJc w:val="left"/>
+      <w:pPr>
+        <w:ind w:left="6480" w:hanging="360"/>
+      </w:pPr>
+      <w:rPr>
+        <w:rFonts w:ascii="Wingdings" w:hAnsi="Wingdings" w:hint="default"/>
+      </w:rPr>
+    </w:lvl>
+  </w:abstractNum>
+  <w:abstractNum w:abstractNumId="10" w15:restartNumberingAfterBreak="0">
     <w:nsid w:val="46FA1DB9"/>
     <w:multiLevelType w:val="hybridMultilevel"/>
     <w:tmpl w:val="D29EAB44"/>
@@ -7545,7 +8986,7 @@
       </w:rPr>
     </w:lvl>
   </w:abstractNum>
-  <w:abstractNum w:abstractNumId="8" w15:restartNumberingAfterBreak="0">
+  <w:abstractNum w:abstractNumId="11" w15:restartNumberingAfterBreak="0">
     <w:nsid w:val="4D5D2977"/>
     <w:multiLevelType w:val="hybridMultilevel"/>
     <w:tmpl w:val="00D41A86"/>
@@ -7658,7 +9099,7 @@
       </w:rPr>
     </w:lvl>
   </w:abstractNum>
-  <w:abstractNum w:abstractNumId="9" w15:restartNumberingAfterBreak="0">
+  <w:abstractNum w:abstractNumId="12" w15:restartNumberingAfterBreak="0">
     <w:nsid w:val="5BCE483C"/>
     <w:multiLevelType w:val="hybridMultilevel"/>
     <w:tmpl w:val="D9784D72"/>
@@ -7771,7 +9212,120 @@
       </w:rPr>
     </w:lvl>
   </w:abstractNum>
-  <w:abstractNum w:abstractNumId="10" w15:restartNumberingAfterBreak="0">
+  <w:abstractNum w:abstractNumId="13" w15:restartNumberingAfterBreak="0">
+    <w:nsid w:val="65983906"/>
+    <w:multiLevelType w:val="hybridMultilevel"/>
+    <w:tmpl w:val="A3A2272C"/>
+    <w:lvl w:ilvl="0" w:tplc="44090001">
+      <w:start w:val="1"/>
+      <w:numFmt w:val="bullet"/>
+      <w:lvlText w:val=""/>
+      <w:lvlJc w:val="left"/>
+      <w:pPr>
+        <w:ind w:left="720" w:hanging="360"/>
+      </w:pPr>
+      <w:rPr>
+        <w:rFonts w:ascii="Symbol" w:hAnsi="Symbol" w:hint="default"/>
+      </w:rPr>
+    </w:lvl>
+    <w:lvl w:ilvl="1" w:tplc="44090003" w:tentative="1">
+      <w:start w:val="1"/>
+      <w:numFmt w:val="bullet"/>
+      <w:lvlText w:val="o"/>
+      <w:lvlJc w:val="left"/>
+      <w:pPr>
+        <w:ind w:left="1440" w:hanging="360"/>
+      </w:pPr>
+      <w:rPr>
+        <w:rFonts w:ascii="Courier New" w:hAnsi="Courier New" w:cs="Courier New" w:hint="default"/>
+      </w:rPr>
+    </w:lvl>
+    <w:lvl w:ilvl="2" w:tplc="44090005" w:tentative="1">
+      <w:start w:val="1"/>
+      <w:numFmt w:val="bullet"/>
+      <w:lvlText w:val=""/>
+      <w:lvlJc w:val="left"/>
+      <w:pPr>
+        <w:ind w:left="2160" w:hanging="360"/>
+      </w:pPr>
+      <w:rPr>
+        <w:rFonts w:ascii="Wingdings" w:hAnsi="Wingdings" w:hint="default"/>
+      </w:rPr>
+    </w:lvl>
+    <w:lvl w:ilvl="3" w:tplc="44090001" w:tentative="1">
+      <w:start w:val="1"/>
+      <w:numFmt w:val="bullet"/>
+      <w:lvlText w:val=""/>
+      <w:lvlJc w:val="left"/>
+      <w:pPr>
+        <w:ind w:left="2880" w:hanging="360"/>
+      </w:pPr>
+      <w:rPr>
+        <w:rFonts w:ascii="Symbol" w:hAnsi="Symbol" w:hint="default"/>
+      </w:rPr>
+    </w:lvl>
+    <w:lvl w:ilvl="4" w:tplc="44090003" w:tentative="1">
+      <w:start w:val="1"/>
+      <w:numFmt w:val="bullet"/>
+      <w:lvlText w:val="o"/>
+      <w:lvlJc w:val="left"/>
+      <w:pPr>
+        <w:ind w:left="3600" w:hanging="360"/>
+      </w:pPr>
+      <w:rPr>
+        <w:rFonts w:ascii="Courier New" w:hAnsi="Courier New" w:cs="Courier New" w:hint="default"/>
+      </w:rPr>
+    </w:lvl>
+    <w:lvl w:ilvl="5" w:tplc="44090005" w:tentative="1">
+      <w:start w:val="1"/>
+      <w:numFmt w:val="bullet"/>
+      <w:lvlText w:val=""/>
+      <w:lvlJc w:val="left"/>
+      <w:pPr>
+        <w:ind w:left="4320" w:hanging="360"/>
+      </w:pPr>
+      <w:rPr>
+        <w:rFonts w:ascii="Wingdings" w:hAnsi="Wingdings" w:hint="default"/>
+      </w:rPr>
+    </w:lvl>
+    <w:lvl w:ilvl="6" w:tplc="44090001" w:tentative="1">
+      <w:start w:val="1"/>
+      <w:numFmt w:val="bullet"/>
+      <w:lvlText w:val=""/>
+      <w:lvlJc w:val="left"/>
+      <w:pPr>
+        <w:ind w:left="5040" w:hanging="360"/>
+      </w:pPr>
+      <w:rPr>
+        <w:rFonts w:ascii="Symbol" w:hAnsi="Symbol" w:hint="default"/>
+      </w:rPr>
+    </w:lvl>
+    <w:lvl w:ilvl="7" w:tplc="44090003" w:tentative="1">
+      <w:start w:val="1"/>
+      <w:numFmt w:val="bullet"/>
+      <w:lvlText w:val="o"/>
+      <w:lvlJc w:val="left"/>
+      <w:pPr>
+        <w:ind w:left="5760" w:hanging="360"/>
+      </w:pPr>
+      <w:rPr>
+        <w:rFonts w:ascii="Courier New" w:hAnsi="Courier New" w:cs="Courier New" w:hint="default"/>
+      </w:rPr>
+    </w:lvl>
+    <w:lvl w:ilvl="8" w:tplc="44090005" w:tentative="1">
+      <w:start w:val="1"/>
+      <w:numFmt w:val="bullet"/>
+      <w:lvlText w:val=""/>
+      <w:lvlJc w:val="left"/>
+      <w:pPr>
+        <w:ind w:left="6480" w:hanging="360"/>
+      </w:pPr>
+      <w:rPr>
+        <w:rFonts w:ascii="Wingdings" w:hAnsi="Wingdings" w:hint="default"/>
+      </w:rPr>
+    </w:lvl>
+  </w:abstractNum>
+  <w:abstractNum w:abstractNumId="14" w15:restartNumberingAfterBreak="0">
     <w:nsid w:val="6D2F7C79"/>
     <w:multiLevelType w:val="hybridMultilevel"/>
     <w:tmpl w:val="278EEB3A"/>
@@ -7884,7 +9438,7 @@
       </w:rPr>
     </w:lvl>
   </w:abstractNum>
-  <w:abstractNum w:abstractNumId="11" w15:restartNumberingAfterBreak="0">
+  <w:abstractNum w:abstractNumId="15" w15:restartNumberingAfterBreak="0">
     <w:nsid w:val="73281A7C"/>
     <w:multiLevelType w:val="hybridMultilevel"/>
     <w:tmpl w:val="85AA5DD2"/>
@@ -7997,41 +9551,169 @@
       </w:rPr>
     </w:lvl>
   </w:abstractNum>
+  <w:abstractNum w:abstractNumId="16" w15:restartNumberingAfterBreak="0">
+    <w:nsid w:val="766844EF"/>
+    <w:multiLevelType w:val="hybridMultilevel"/>
+    <w:tmpl w:val="87E4D1F2"/>
+    <w:lvl w:ilvl="0" w:tplc="44090001">
+      <w:start w:val="1"/>
+      <w:numFmt w:val="bullet"/>
+      <w:lvlText w:val=""/>
+      <w:lvlJc w:val="left"/>
+      <w:pPr>
+        <w:ind w:left="720" w:hanging="360"/>
+      </w:pPr>
+      <w:rPr>
+        <w:rFonts w:ascii="Symbol" w:hAnsi="Symbol" w:hint="default"/>
+      </w:rPr>
+    </w:lvl>
+    <w:lvl w:ilvl="1" w:tplc="44090003" w:tentative="1">
+      <w:start w:val="1"/>
+      <w:numFmt w:val="bullet"/>
+      <w:lvlText w:val="o"/>
+      <w:lvlJc w:val="left"/>
+      <w:pPr>
+        <w:ind w:left="1440" w:hanging="360"/>
+      </w:pPr>
+      <w:rPr>
+        <w:rFonts w:ascii="Courier New" w:hAnsi="Courier New" w:cs="Courier New" w:hint="default"/>
+      </w:rPr>
+    </w:lvl>
+    <w:lvl w:ilvl="2" w:tplc="44090005" w:tentative="1">
+      <w:start w:val="1"/>
+      <w:numFmt w:val="bullet"/>
+      <w:lvlText w:val=""/>
+      <w:lvlJc w:val="left"/>
+      <w:pPr>
+        <w:ind w:left="2160" w:hanging="360"/>
+      </w:pPr>
+      <w:rPr>
+        <w:rFonts w:ascii="Wingdings" w:hAnsi="Wingdings" w:hint="default"/>
+      </w:rPr>
+    </w:lvl>
+    <w:lvl w:ilvl="3" w:tplc="44090001" w:tentative="1">
+      <w:start w:val="1"/>
+      <w:numFmt w:val="bullet"/>
+      <w:lvlText w:val=""/>
+      <w:lvlJc w:val="left"/>
+      <w:pPr>
+        <w:ind w:left="2880" w:hanging="360"/>
+      </w:pPr>
+      <w:rPr>
+        <w:rFonts w:ascii="Symbol" w:hAnsi="Symbol" w:hint="default"/>
+      </w:rPr>
+    </w:lvl>
+    <w:lvl w:ilvl="4" w:tplc="44090003" w:tentative="1">
+      <w:start w:val="1"/>
+      <w:numFmt w:val="bullet"/>
+      <w:lvlText w:val="o"/>
+      <w:lvlJc w:val="left"/>
+      <w:pPr>
+        <w:ind w:left="3600" w:hanging="360"/>
+      </w:pPr>
+      <w:rPr>
+        <w:rFonts w:ascii="Courier New" w:hAnsi="Courier New" w:cs="Courier New" w:hint="default"/>
+      </w:rPr>
+    </w:lvl>
+    <w:lvl w:ilvl="5" w:tplc="44090005" w:tentative="1">
+      <w:start w:val="1"/>
+      <w:numFmt w:val="bullet"/>
+      <w:lvlText w:val=""/>
+      <w:lvlJc w:val="left"/>
+      <w:pPr>
+        <w:ind w:left="4320" w:hanging="360"/>
+      </w:pPr>
+      <w:rPr>
+        <w:rFonts w:ascii="Wingdings" w:hAnsi="Wingdings" w:hint="default"/>
+      </w:rPr>
+    </w:lvl>
+    <w:lvl w:ilvl="6" w:tplc="44090001" w:tentative="1">
+      <w:start w:val="1"/>
+      <w:numFmt w:val="bullet"/>
+      <w:lvlText w:val=""/>
+      <w:lvlJc w:val="left"/>
+      <w:pPr>
+        <w:ind w:left="5040" w:hanging="360"/>
+      </w:pPr>
+      <w:rPr>
+        <w:rFonts w:ascii="Symbol" w:hAnsi="Symbol" w:hint="default"/>
+      </w:rPr>
+    </w:lvl>
+    <w:lvl w:ilvl="7" w:tplc="44090003" w:tentative="1">
+      <w:start w:val="1"/>
+      <w:numFmt w:val="bullet"/>
+      <w:lvlText w:val="o"/>
+      <w:lvlJc w:val="left"/>
+      <w:pPr>
+        <w:ind w:left="5760" w:hanging="360"/>
+      </w:pPr>
+      <w:rPr>
+        <w:rFonts w:ascii="Courier New" w:hAnsi="Courier New" w:cs="Courier New" w:hint="default"/>
+      </w:rPr>
+    </w:lvl>
+    <w:lvl w:ilvl="8" w:tplc="44090005" w:tentative="1">
+      <w:start w:val="1"/>
+      <w:numFmt w:val="bullet"/>
+      <w:lvlText w:val=""/>
+      <w:lvlJc w:val="left"/>
+      <w:pPr>
+        <w:ind w:left="6480" w:hanging="360"/>
+      </w:pPr>
+      <w:rPr>
+        <w:rFonts w:ascii="Wingdings" w:hAnsi="Wingdings" w:hint="default"/>
+      </w:rPr>
+    </w:lvl>
+  </w:abstractNum>
   <w:num w:numId="1" w16cid:durableId="1790515221">
+    <w:abstractNumId w:val="3"/>
+  </w:num>
+  <w:num w:numId="2" w16cid:durableId="187334069">
+    <w:abstractNumId w:val="12"/>
+  </w:num>
+  <w:num w:numId="3" w16cid:durableId="1580485273">
+    <w:abstractNumId w:val="2"/>
+  </w:num>
+  <w:num w:numId="4" w16cid:durableId="1066681653">
+    <w:abstractNumId w:val="11"/>
+  </w:num>
+  <w:num w:numId="5" w16cid:durableId="140344507">
+    <w:abstractNumId w:val="15"/>
+  </w:num>
+  <w:num w:numId="6" w16cid:durableId="891962121">
+    <w:abstractNumId w:val="14"/>
+  </w:num>
+  <w:num w:numId="7" w16cid:durableId="867107768">
+    <w:abstractNumId w:val="10"/>
+  </w:num>
+  <w:num w:numId="8" w16cid:durableId="65149326">
+    <w:abstractNumId w:val="5"/>
+  </w:num>
+  <w:num w:numId="9" w16cid:durableId="1366828828">
+    <w:abstractNumId w:val="6"/>
+  </w:num>
+  <w:num w:numId="10" w16cid:durableId="2104757956">
+    <w:abstractNumId w:val="8"/>
+  </w:num>
+  <w:num w:numId="11" w16cid:durableId="857088405">
+    <w:abstractNumId w:val="4"/>
+  </w:num>
+  <w:num w:numId="12" w16cid:durableId="2008095559">
+    <w:abstractNumId w:val="7"/>
+  </w:num>
+  <w:num w:numId="13" w16cid:durableId="461920555">
+    <w:abstractNumId w:val="0"/>
+  </w:num>
+  <w:num w:numId="14" w16cid:durableId="1987009257">
+    <w:abstractNumId w:val="13"/>
+  </w:num>
+  <w:num w:numId="15" w16cid:durableId="820391354">
+    <w:abstractNumId w:val="16"/>
+  </w:num>
+  <w:num w:numId="16" w16cid:durableId="1956666921">
     <w:abstractNumId w:val="1"/>
   </w:num>
-  <w:num w:numId="2" w16cid:durableId="187334069">
+  <w:num w:numId="17" w16cid:durableId="2047176959">
     <w:abstractNumId w:val="9"/>
-  </w:num>
-  <w:num w:numId="3" w16cid:durableId="1580485273">
-    <w:abstractNumId w:val="0"/>
-  </w:num>
-  <w:num w:numId="4" w16cid:durableId="1066681653">
-    <w:abstractNumId w:val="8"/>
-  </w:num>
-  <w:num w:numId="5" w16cid:durableId="140344507">
-    <w:abstractNumId w:val="11"/>
-  </w:num>
-  <w:num w:numId="6" w16cid:durableId="891962121">
-    <w:abstractNumId w:val="10"/>
-  </w:num>
-  <w:num w:numId="7" w16cid:durableId="867107768">
-    <w:abstractNumId w:val="7"/>
-  </w:num>
-  <w:num w:numId="8" w16cid:durableId="65149326">
-    <w:abstractNumId w:val="3"/>
-  </w:num>
-  <w:num w:numId="9" w16cid:durableId="1366828828">
-    <w:abstractNumId w:val="4"/>
-  </w:num>
-  <w:num w:numId="10" w16cid:durableId="2104757956">
-    <w:abstractNumId w:val="6"/>
-  </w:num>
-  <w:num w:numId="11" w16cid:durableId="857088405">
-    <w:abstractNumId w:val="2"/>
-  </w:num>
-  <w:num w:numId="12" w16cid:durableId="2008095559">
-    <w:abstractNumId w:val="5"/>
   </w:num>
 </w:numbering>
 </file>

</xml_diff>